<commit_message>
feat: implement BigQuery load layer with idempotency logic
</commit_message>
<xml_diff>
--- a/progress/Diario de Trabajo.docx
+++ b/progress/Diario de Trabajo.docx
@@ -692,7 +692,534 @@
         <w:t>El script src/extract.py ya es un módulo funcional, seguro e independiente.</w:t>
       </w:r>
     </w:p>
+    <w:p>
+      <w:r>
+        <w:rPr>
+          <w:noProof/>
+        </w:rPr>
+        <mc:AlternateContent>
+          <mc:Choice Requires="wps">
+            <w:drawing>
+              <wp:anchor distT="0" distB="0" distL="114300" distR="114300" simplePos="0" relativeHeight="251659264" behindDoc="0" locked="0" layoutInCell="1" allowOverlap="1" wp14:anchorId="33F113CE" wp14:editId="2670E26F">
+                <wp:simplePos x="0" y="0"/>
+                <wp:positionH relativeFrom="column">
+                  <wp:posOffset>-46672</wp:posOffset>
+                </wp:positionH>
+                <wp:positionV relativeFrom="paragraph">
+                  <wp:posOffset>147003</wp:posOffset>
+                </wp:positionV>
+                <wp:extent cx="5414962" cy="0"/>
+                <wp:effectExtent l="0" t="0" r="0" b="0"/>
+                <wp:wrapNone/>
+                <wp:docPr id="614579064" name="Conector recto 1"/>
+                <wp:cNvGraphicFramePr/>
+                <a:graphic xmlns:a="http://schemas.openxmlformats.org/drawingml/2006/main">
+                  <a:graphicData uri="http://schemas.microsoft.com/office/word/2010/wordprocessingShape">
+                    <wps:wsp>
+                      <wps:cNvCnPr/>
+                      <wps:spPr>
+                        <a:xfrm>
+                          <a:off x="0" y="0"/>
+                          <a:ext cx="5414962" cy="0"/>
+                        </a:xfrm>
+                        <a:prstGeom prst="line">
+                          <a:avLst/>
+                        </a:prstGeom>
+                      </wps:spPr>
+                      <wps:style>
+                        <a:lnRef idx="2">
+                          <a:schemeClr val="accent1"/>
+                        </a:lnRef>
+                        <a:fillRef idx="0">
+                          <a:schemeClr val="accent1"/>
+                        </a:fillRef>
+                        <a:effectRef idx="1">
+                          <a:schemeClr val="accent1"/>
+                        </a:effectRef>
+                        <a:fontRef idx="minor">
+                          <a:schemeClr val="tx1"/>
+                        </a:fontRef>
+                      </wps:style>
+                      <wps:bodyPr/>
+                    </wps:wsp>
+                  </a:graphicData>
+                </a:graphic>
+              </wp:anchor>
+            </w:drawing>
+          </mc:Choice>
+          <mc:Fallback>
+            <w:pict>
+              <v:line w14:anchorId="7839C990" id="Conector recto 1" o:spid="_x0000_s1026" style="position:absolute;z-index:251659264;visibility:visible;mso-wrap-style:square;mso-wrap-distance-left:9pt;mso-wrap-distance-top:0;mso-wrap-distance-right:9pt;mso-wrap-distance-bottom:0;mso-position-horizontal:absolute;mso-position-horizontal-relative:text;mso-position-vertical:absolute;mso-position-vertical-relative:text" from="-3.65pt,11.6pt" to="422.7pt,11.6pt" o:gfxdata="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" strokecolor="#156082 [3204]" strokeweight="1.5pt">
+                <v:stroke joinstyle="miter"/>
+              </v:line>
+            </w:pict>
+          </mc:Fallback>
+        </mc:AlternateContent>
+      </w:r>
+    </w:p>
+    <w:p>
+      <w:pPr>
+        <w:rPr>
+          <w:b/>
+          <w:bCs/>
+        </w:rPr>
+      </w:pPr>
+      <w:r>
+        <w:rPr>
+          <w:b/>
+          <w:bCs/>
+        </w:rPr>
+        <w:t>12/07/2026</w:t>
+      </w:r>
+      <w:r>
+        <w:rPr>
+          <w:b/>
+          <w:bCs/>
+        </w:rPr>
+        <w:t xml:space="preserve"> – 1</w:t>
+      </w:r>
+      <w:r>
+        <w:rPr>
+          <w:b/>
+          <w:bCs/>
+        </w:rPr>
+        <w:t>5:46</w:t>
+      </w:r>
+    </w:p>
+    <w:p>
+      <w:r>
+        <w:t>Hemos consolidado la capa de transformación (transform.py) de tu proyecto de análisis financiero. Hemos logrado que el sistema no solo limpie datos, sino que los enriquezca con inteligencia semántica, convirtiendo titulares no estructurados en métricas cuantitativas listas para el análisis.</w:t>
+      </w:r>
+    </w:p>
+    <w:p>
+      <w:pPr>
+        <w:rPr>
+          <w:b/>
+          <w:bCs/>
+        </w:rPr>
+      </w:pPr>
+      <w:r>
+        <w:rPr>
+          <w:b/>
+          <w:bCs/>
+        </w:rPr>
+        <w:t>2. Decisiones de diseño implementadas</w:t>
+      </w:r>
+    </w:p>
+    <w:p>
+      <w:pPr>
+        <w:numPr>
+          <w:ilvl w:val="0"/>
+          <w:numId w:val="5"/>
+        </w:numPr>
+      </w:pPr>
+      <w:r>
+        <w:rPr>
+          <w:b/>
+          <w:bCs/>
+        </w:rPr>
+        <w:t>Modelo IA:</w:t>
+      </w:r>
+      <w:r>
+        <w:t xml:space="preserve"> Hemos optado por gemini-</w:t>
+      </w:r>
+      <w:r>
+        <w:t>3</w:t>
+      </w:r>
+      <w:r>
+        <w:t>.5-</w:t>
+      </w:r>
+      <w:proofErr w:type="gramStart"/>
+      <w:r>
+        <w:t>flash</w:t>
+      </w:r>
+      <w:proofErr w:type="gramEnd"/>
+      <w:r>
+        <w:t xml:space="preserve"> debido a su óptimo equilibrio entre latencia (velocidad) y coste, ideal para el procesamiento de volúmenes de datos financieros diarios.</w:t>
+      </w:r>
+    </w:p>
+    <w:p>
+      <w:pPr>
+        <w:numPr>
+          <w:ilvl w:val="0"/>
+          <w:numId w:val="5"/>
+        </w:numPr>
+      </w:pPr>
+      <w:r>
+        <w:rPr>
+          <w:b/>
+          <w:bCs/>
+        </w:rPr>
+        <w:t xml:space="preserve">Ingeniería de </w:t>
+      </w:r>
+      <w:proofErr w:type="spellStart"/>
+      <w:r>
+        <w:rPr>
+          <w:b/>
+          <w:bCs/>
+        </w:rPr>
+        <w:t>Prompts</w:t>
+      </w:r>
+      <w:proofErr w:type="spellEnd"/>
+      <w:r>
+        <w:rPr>
+          <w:b/>
+          <w:bCs/>
+        </w:rPr>
+        <w:t>:</w:t>
+      </w:r>
+      <w:r>
+        <w:t xml:space="preserve"> Hemos evolucionado de un </w:t>
+      </w:r>
+      <w:proofErr w:type="spellStart"/>
+      <w:r>
+        <w:t>prompt</w:t>
+      </w:r>
+      <w:proofErr w:type="spellEnd"/>
+      <w:r>
+        <w:t xml:space="preserve"> básico a uno de "análisis experto", definiendo explícitamente qué constituye un sentimiento positivo, neutro o negativo para evitar ambigüedades.</w:t>
+      </w:r>
+    </w:p>
+    <w:p>
+      <w:pPr>
+        <w:numPr>
+          <w:ilvl w:val="0"/>
+          <w:numId w:val="5"/>
+        </w:numPr>
+      </w:pPr>
+      <w:r>
+        <w:rPr>
+          <w:b/>
+          <w:bCs/>
+        </w:rPr>
+        <w:t>Estrategia de Ventana Temporal (</w:t>
+      </w:r>
+      <w:proofErr w:type="spellStart"/>
+      <w:r>
+        <w:rPr>
+          <w:b/>
+          <w:bCs/>
+        </w:rPr>
+        <w:t>Lagged</w:t>
+      </w:r>
+      <w:proofErr w:type="spellEnd"/>
+      <w:r>
+        <w:rPr>
+          <w:b/>
+          <w:bCs/>
+        </w:rPr>
+        <w:t xml:space="preserve"> </w:t>
+      </w:r>
+      <w:proofErr w:type="spellStart"/>
+      <w:r>
+        <w:rPr>
+          <w:b/>
+          <w:bCs/>
+        </w:rPr>
+        <w:t>Analysis</w:t>
+      </w:r>
+      <w:proofErr w:type="spellEnd"/>
+      <w:r>
+        <w:rPr>
+          <w:b/>
+          <w:bCs/>
+        </w:rPr>
+        <w:t>):</w:t>
+      </w:r>
+      <w:r>
+        <w:t xml:space="preserve"> Hemos modificado la lógica de extracción (extract.py) para capturar una ventana de 7 días, pasando de un análisis reactivo del "día a día" a un análisis de tendencia semanal, lo cual es mucho más robusto para futuros modelos predictivos.</w:t>
+      </w:r>
+    </w:p>
+    <w:p>
+      <w:pPr>
+        <w:numPr>
+          <w:ilvl w:val="0"/>
+          <w:numId w:val="5"/>
+        </w:numPr>
+      </w:pPr>
+      <w:r>
+        <w:rPr>
+          <w:b/>
+          <w:bCs/>
+        </w:rPr>
+        <w:lastRenderedPageBreak/>
+        <w:t>Consolidación de Datos:</w:t>
+      </w:r>
+      <w:r>
+        <w:t xml:space="preserve"> Hemos implementado la </w:t>
+      </w:r>
+      <w:r>
+        <w:rPr>
+          <w:b/>
+          <w:bCs/>
+        </w:rPr>
+        <w:t>media aritmética</w:t>
+      </w:r>
+      <w:r>
+        <w:t xml:space="preserve"> de los sentimientos como la métrica oficial para reducir la volatilidad del ruido informativo y alinearla temporalmente con el precio de cierre diario.</w:t>
+      </w:r>
+    </w:p>
+    <w:p>
+      <w:pPr>
+        <w:rPr>
+          <w:b/>
+          <w:bCs/>
+        </w:rPr>
+      </w:pPr>
+      <w:r>
+        <w:rPr>
+          <w:b/>
+          <w:bCs/>
+        </w:rPr>
+        <w:t>3. Aprendizajes clave</w:t>
+      </w:r>
+    </w:p>
+    <w:p>
+      <w:pPr>
+        <w:numPr>
+          <w:ilvl w:val="0"/>
+          <w:numId w:val="6"/>
+        </w:numPr>
+      </w:pPr>
+      <w:proofErr w:type="spellStart"/>
+      <w:r>
+        <w:rPr>
+          <w:b/>
+          <w:bCs/>
+        </w:rPr>
+        <w:t>Broadcasting</w:t>
+      </w:r>
+      <w:proofErr w:type="spellEnd"/>
+      <w:r>
+        <w:rPr>
+          <w:b/>
+          <w:bCs/>
+        </w:rPr>
+        <w:t xml:space="preserve"> en Pandas:</w:t>
+      </w:r>
+      <w:r>
+        <w:t xml:space="preserve"> He comprendido que Pandas es capaz de realizar operaciones vectorizadas (expandir un valor único a toda una columna) de forma implícita, lo que garantiza la integridad de los datos sin necesidad de bucles innecesarios.</w:t>
+      </w:r>
+    </w:p>
+    <w:p>
+      <w:pPr>
+        <w:numPr>
+          <w:ilvl w:val="0"/>
+          <w:numId w:val="6"/>
+        </w:numPr>
+      </w:pPr>
+      <w:r>
+        <w:rPr>
+          <w:b/>
+          <w:bCs/>
+        </w:rPr>
+        <w:t xml:space="preserve">Time-Series </w:t>
+      </w:r>
+      <w:proofErr w:type="spellStart"/>
+      <w:r>
+        <w:rPr>
+          <w:b/>
+          <w:bCs/>
+        </w:rPr>
+        <w:t>Alignment</w:t>
+      </w:r>
+      <w:proofErr w:type="spellEnd"/>
+      <w:r>
+        <w:rPr>
+          <w:b/>
+          <w:bCs/>
+        </w:rPr>
+        <w:t>:</w:t>
+      </w:r>
+      <w:r>
+        <w:t xml:space="preserve"> He aprendido que el mayor riesgo en el análisis financiero es el </w:t>
+      </w:r>
+      <w:proofErr w:type="gramStart"/>
+      <w:r>
+        <w:rPr>
+          <w:i/>
+          <w:iCs/>
+        </w:rPr>
+        <w:t>Look</w:t>
+      </w:r>
+      <w:proofErr w:type="gramEnd"/>
+      <w:r>
+        <w:rPr>
+          <w:i/>
+          <w:iCs/>
+        </w:rPr>
+        <w:t>-</w:t>
+      </w:r>
+      <w:proofErr w:type="spellStart"/>
+      <w:r>
+        <w:rPr>
+          <w:i/>
+          <w:iCs/>
+        </w:rPr>
+        <w:t>ahead</w:t>
+      </w:r>
+      <w:proofErr w:type="spellEnd"/>
+      <w:r>
+        <w:rPr>
+          <w:i/>
+          <w:iCs/>
+        </w:rPr>
+        <w:t xml:space="preserve"> </w:t>
+      </w:r>
+      <w:proofErr w:type="spellStart"/>
+      <w:r>
+        <w:rPr>
+          <w:i/>
+          <w:iCs/>
+        </w:rPr>
+        <w:t>bias</w:t>
+      </w:r>
+      <w:proofErr w:type="spellEnd"/>
+      <w:r>
+        <w:t>. La clave de un pipeline profesional es asegurar que las fuentes de datos (precios y noticias) estén perfectamente sincronizadas en el tiempo.</w:t>
+      </w:r>
+    </w:p>
+    <w:p>
+      <w:pPr>
+        <w:numPr>
+          <w:ilvl w:val="0"/>
+          <w:numId w:val="6"/>
+        </w:numPr>
+      </w:pPr>
+      <w:proofErr w:type="spellStart"/>
+      <w:r>
+        <w:rPr>
+          <w:b/>
+          <w:bCs/>
+        </w:rPr>
+        <w:t>Testing</w:t>
+      </w:r>
+      <w:proofErr w:type="spellEnd"/>
+      <w:r>
+        <w:rPr>
+          <w:b/>
+          <w:bCs/>
+        </w:rPr>
+        <w:t xml:space="preserve"> Iterativo:</w:t>
+      </w:r>
+      <w:r>
+        <w:t xml:space="preserve"> He aprendido la importancia de realizar pruebas unitarias aisladas (</w:t>
+      </w:r>
+      <w:proofErr w:type="spellStart"/>
+      <w:r>
+        <w:t>if</w:t>
+      </w:r>
+      <w:proofErr w:type="spellEnd"/>
+      <w:r>
+        <w:t xml:space="preserve"> __</w:t>
+      </w:r>
+      <w:proofErr w:type="spellStart"/>
+      <w:r>
+        <w:t>name</w:t>
+      </w:r>
+      <w:proofErr w:type="spellEnd"/>
+      <w:r>
+        <w:t>__ == "__</w:t>
+      </w:r>
+      <w:proofErr w:type="spellStart"/>
+      <w:r>
+        <w:t>main</w:t>
+      </w:r>
+      <w:proofErr w:type="spellEnd"/>
+      <w:r>
+        <w:t>__":) para validar módulos antes de integrarlos en la arquitectura principal.</w:t>
+      </w:r>
+    </w:p>
+    <w:p>
+      <w:pPr>
+        <w:rPr>
+          <w:b/>
+          <w:bCs/>
+        </w:rPr>
+      </w:pPr>
+      <w:r>
+        <w:rPr>
+          <w:b/>
+          <w:bCs/>
+        </w:rPr>
+        <w:t>4. Estado de la arquitectura</w:t>
+      </w:r>
+    </w:p>
+    <w:p>
+      <w:pPr>
+        <w:numPr>
+          <w:ilvl w:val="0"/>
+          <w:numId w:val="7"/>
+        </w:numPr>
+      </w:pPr>
+      <w:proofErr w:type="spellStart"/>
+      <w:r>
+        <w:rPr>
+          <w:b/>
+          <w:bCs/>
+        </w:rPr>
+        <w:t>Extract</w:t>
+      </w:r>
+      <w:proofErr w:type="spellEnd"/>
+      <w:r>
+        <w:rPr>
+          <w:b/>
+          <w:bCs/>
+        </w:rPr>
+        <w:t>:</w:t>
+      </w:r>
+      <w:r>
+        <w:t xml:space="preserve"> Completo (con filtros de fecha y ventana de 7 días).</w:t>
+      </w:r>
+    </w:p>
+    <w:p>
+      <w:pPr>
+        <w:numPr>
+          <w:ilvl w:val="0"/>
+          <w:numId w:val="7"/>
+        </w:numPr>
+      </w:pPr>
+      <w:proofErr w:type="spellStart"/>
+      <w:r>
+        <w:rPr>
+          <w:b/>
+          <w:bCs/>
+        </w:rPr>
+        <w:t>Transform</w:t>
+      </w:r>
+      <w:proofErr w:type="spellEnd"/>
+      <w:r>
+        <w:rPr>
+          <w:b/>
+          <w:bCs/>
+        </w:rPr>
+        <w:t>:</w:t>
+      </w:r>
+      <w:r>
+        <w:t xml:space="preserve"> Completo y validado (limpieza + análisis IA + consolidación).</w:t>
+      </w:r>
+    </w:p>
+    <w:p>
+      <w:pPr>
+        <w:numPr>
+          <w:ilvl w:val="0"/>
+          <w:numId w:val="7"/>
+        </w:numPr>
+      </w:pPr>
+      <w:r>
+        <w:rPr>
+          <w:b/>
+          <w:bCs/>
+        </w:rPr>
+        <w:t>Load:</w:t>
+      </w:r>
+      <w:r>
+        <w:t xml:space="preserve"> Pendiente (próxima fase).</w:t>
+      </w:r>
+    </w:p>
     <w:p/>
+    <w:p/>
+    <w:p/>
     <w:p>
       <w:pPr>
         <w:rPr>
@@ -700,7 +1227,6 @@
         </w:rPr>
       </w:pPr>
     </w:p>
-    <w:p/>
     <w:sectPr>
       <w:pgSz w:w="11906" w:h="16838"/>
       <w:pgMar w:top="1417" w:right="1701" w:bottom="1417" w:left="1701" w:header="708" w:footer="708" w:gutter="0"/>
@@ -714,6 +1240,453 @@
 <file path=word/numbering.xml><?xml version="1.0" encoding="utf-8"?>
 <w:numbering xmlns:wpc="http://schemas.microsoft.com/office/word/2010/wordprocessingCanvas" xmlns:cx="http://schemas.microsoft.com/office/drawing/2014/chartex" xmlns:cx1="http://schemas.microsoft.com/office/drawing/2015/9/8/chartex" xmlns:cx2="http://schemas.microsoft.com/office/drawing/2015/10/21/chartex" xmlns:cx3="http://schemas.microsoft.com/office/drawing/2016/5/9/chartex" xmlns:cx4="http://schemas.microsoft.com/office/drawing/2016/5/10/chartex" xmlns:cx5="http://schemas.microsoft.com/office/drawing/2016/5/11/chartex" xmlns:cx6="http://schemas.microsoft.com/office/drawing/2016/5/12/chartex" xmlns:cx7="http://schemas.microsoft.com/office/drawing/2016/5/13/chartex" xmlns:cx8="http://schemas.microsoft.com/office/drawing/2016/5/14/chartex" xmlns:mc="http://schemas.openxmlformats.org/markup-compatibility/2006" xmlns:aink="http://schemas.microsoft.com/office/drawing/2016/ink" xmlns:am3d="http://schemas.microsoft.com/office/drawing/2017/model3d" xmlns:o="urn:schemas-microsoft-com:office:office" xmlns:oel="http://schemas.microsoft.com/office/2019/extlst" xmlns:r="http://schemas.openxmlformats.org/officeDocument/2006/relationships" xmlns:m="http://schemas.openxmlformats.org/officeDocument/2006/math" xmlns:v="urn:schemas-microsoft-com:vml" xmlns:wp14="http://schemas.microsoft.com/office/word/2010/wordprocessingDrawing" xmlns:wp="http://schemas.openxmlformats.org/drawingml/2006/wordprocessingDrawing" xmlns:w10="urn:schemas-microsoft-com:office:word" xmlns:w="http://schemas.openxmlformats.org/wordprocessingml/2006/main" xmlns:w14="http://schemas.microsoft.com/office/word/2010/wordml" xmlns:w15="http://schemas.microsoft.com/office/word/2012/wordml" xmlns:w16cex="http://schemas.microsoft.com/office/word/2018/wordml/cex" xmlns:w16cid="http://schemas.microsoft.com/office/word/2016/wordml/cid" xmlns:w16="http://schemas.microsoft.com/office/word/2018/wordml" xmlns:w16du="http://schemas.microsoft.com/office/word/2023/wordml/word16du" xmlns:w16sdtdh="http://schemas.microsoft.com/office/word/2020/wordml/sdtdatahash" xmlns:w16sdtfl="http://schemas.microsoft.com/office/word/2024/wordml/sdtformatlock" xmlns:w16se="http://schemas.microsoft.com/office/word/2015/wordml/symex" xmlns:wpg="http://schemas.microsoft.com/office/word/2010/wordprocessingGroup" xmlns:wpi="http://schemas.microsoft.com/office/word/2010/wordprocessingInk" xmlns:wne="http://schemas.microsoft.com/office/word/2006/wordml" xmlns:wps="http://schemas.microsoft.com/office/word/2010/wordprocessingShape" mc:Ignorable="w14 w15 w16se w16cid w16 w16cex w16sdtdh w16sdtfl w16du wp14">
   <w:abstractNum w:abstractNumId="0" w15:restartNumberingAfterBreak="0">
+    <w:nsid w:val="3A5458EA"/>
+    <w:multiLevelType w:val="multilevel"/>
+    <w:tmpl w:val="A61CFDEC"/>
+    <w:lvl w:ilvl="0">
+      <w:start w:val="1"/>
+      <w:numFmt w:val="bullet"/>
+      <w:lvlText w:val=""/>
+      <w:lvlJc w:val="left"/>
+      <w:pPr>
+        <w:tabs>
+          <w:tab w:val="num" w:pos="720"/>
+        </w:tabs>
+        <w:ind w:left="720" w:hanging="360"/>
+      </w:pPr>
+      <w:rPr>
+        <w:rFonts w:ascii="Symbol" w:hAnsi="Symbol" w:hint="default"/>
+        <w:sz w:val="20"/>
+      </w:rPr>
+    </w:lvl>
+    <w:lvl w:ilvl="1" w:tentative="1">
+      <w:start w:val="1"/>
+      <w:numFmt w:val="bullet"/>
+      <w:lvlText w:val="o"/>
+      <w:lvlJc w:val="left"/>
+      <w:pPr>
+        <w:tabs>
+          <w:tab w:val="num" w:pos="1440"/>
+        </w:tabs>
+        <w:ind w:left="1440" w:hanging="360"/>
+      </w:pPr>
+      <w:rPr>
+        <w:rFonts w:ascii="Courier New" w:hAnsi="Courier New" w:hint="default"/>
+        <w:sz w:val="20"/>
+      </w:rPr>
+    </w:lvl>
+    <w:lvl w:ilvl="2" w:tentative="1">
+      <w:start w:val="1"/>
+      <w:numFmt w:val="bullet"/>
+      <w:lvlText w:val=""/>
+      <w:lvlJc w:val="left"/>
+      <w:pPr>
+        <w:tabs>
+          <w:tab w:val="num" w:pos="2160"/>
+        </w:tabs>
+        <w:ind w:left="2160" w:hanging="360"/>
+      </w:pPr>
+      <w:rPr>
+        <w:rFonts w:ascii="Wingdings" w:hAnsi="Wingdings" w:hint="default"/>
+        <w:sz w:val="20"/>
+      </w:rPr>
+    </w:lvl>
+    <w:lvl w:ilvl="3" w:tentative="1">
+      <w:start w:val="1"/>
+      <w:numFmt w:val="bullet"/>
+      <w:lvlText w:val=""/>
+      <w:lvlJc w:val="left"/>
+      <w:pPr>
+        <w:tabs>
+          <w:tab w:val="num" w:pos="2880"/>
+        </w:tabs>
+        <w:ind w:left="2880" w:hanging="360"/>
+      </w:pPr>
+      <w:rPr>
+        <w:rFonts w:ascii="Wingdings" w:hAnsi="Wingdings" w:hint="default"/>
+        <w:sz w:val="20"/>
+      </w:rPr>
+    </w:lvl>
+    <w:lvl w:ilvl="4" w:tentative="1">
+      <w:start w:val="1"/>
+      <w:numFmt w:val="bullet"/>
+      <w:lvlText w:val=""/>
+      <w:lvlJc w:val="left"/>
+      <w:pPr>
+        <w:tabs>
+          <w:tab w:val="num" w:pos="3600"/>
+        </w:tabs>
+        <w:ind w:left="3600" w:hanging="360"/>
+      </w:pPr>
+      <w:rPr>
+        <w:rFonts w:ascii="Wingdings" w:hAnsi="Wingdings" w:hint="default"/>
+        <w:sz w:val="20"/>
+      </w:rPr>
+    </w:lvl>
+    <w:lvl w:ilvl="5" w:tentative="1">
+      <w:start w:val="1"/>
+      <w:numFmt w:val="bullet"/>
+      <w:lvlText w:val=""/>
+      <w:lvlJc w:val="left"/>
+      <w:pPr>
+        <w:tabs>
+          <w:tab w:val="num" w:pos="4320"/>
+        </w:tabs>
+        <w:ind w:left="4320" w:hanging="360"/>
+      </w:pPr>
+      <w:rPr>
+        <w:rFonts w:ascii="Wingdings" w:hAnsi="Wingdings" w:hint="default"/>
+        <w:sz w:val="20"/>
+      </w:rPr>
+    </w:lvl>
+    <w:lvl w:ilvl="6" w:tentative="1">
+      <w:start w:val="1"/>
+      <w:numFmt w:val="bullet"/>
+      <w:lvlText w:val=""/>
+      <w:lvlJc w:val="left"/>
+      <w:pPr>
+        <w:tabs>
+          <w:tab w:val="num" w:pos="5040"/>
+        </w:tabs>
+        <w:ind w:left="5040" w:hanging="360"/>
+      </w:pPr>
+      <w:rPr>
+        <w:rFonts w:ascii="Wingdings" w:hAnsi="Wingdings" w:hint="default"/>
+        <w:sz w:val="20"/>
+      </w:rPr>
+    </w:lvl>
+    <w:lvl w:ilvl="7" w:tentative="1">
+      <w:start w:val="1"/>
+      <w:numFmt w:val="bullet"/>
+      <w:lvlText w:val=""/>
+      <w:lvlJc w:val="left"/>
+      <w:pPr>
+        <w:tabs>
+          <w:tab w:val="num" w:pos="5760"/>
+        </w:tabs>
+        <w:ind w:left="5760" w:hanging="360"/>
+      </w:pPr>
+      <w:rPr>
+        <w:rFonts w:ascii="Wingdings" w:hAnsi="Wingdings" w:hint="default"/>
+        <w:sz w:val="20"/>
+      </w:rPr>
+    </w:lvl>
+    <w:lvl w:ilvl="8" w:tentative="1">
+      <w:start w:val="1"/>
+      <w:numFmt w:val="bullet"/>
+      <w:lvlText w:val=""/>
+      <w:lvlJc w:val="left"/>
+      <w:pPr>
+        <w:tabs>
+          <w:tab w:val="num" w:pos="6480"/>
+        </w:tabs>
+        <w:ind w:left="6480" w:hanging="360"/>
+      </w:pPr>
+      <w:rPr>
+        <w:rFonts w:ascii="Wingdings" w:hAnsi="Wingdings" w:hint="default"/>
+        <w:sz w:val="20"/>
+      </w:rPr>
+    </w:lvl>
+  </w:abstractNum>
+  <w:abstractNum w:abstractNumId="1" w15:restartNumberingAfterBreak="0">
+    <w:nsid w:val="4EBA0CA9"/>
+    <w:multiLevelType w:val="multilevel"/>
+    <w:tmpl w:val="D95659C0"/>
+    <w:lvl w:ilvl="0">
+      <w:start w:val="1"/>
+      <w:numFmt w:val="bullet"/>
+      <w:lvlText w:val=""/>
+      <w:lvlJc w:val="left"/>
+      <w:pPr>
+        <w:tabs>
+          <w:tab w:val="num" w:pos="720"/>
+        </w:tabs>
+        <w:ind w:left="720" w:hanging="360"/>
+      </w:pPr>
+      <w:rPr>
+        <w:rFonts w:ascii="Symbol" w:hAnsi="Symbol" w:hint="default"/>
+        <w:sz w:val="20"/>
+      </w:rPr>
+    </w:lvl>
+    <w:lvl w:ilvl="1" w:tentative="1">
+      <w:start w:val="1"/>
+      <w:numFmt w:val="bullet"/>
+      <w:lvlText w:val="o"/>
+      <w:lvlJc w:val="left"/>
+      <w:pPr>
+        <w:tabs>
+          <w:tab w:val="num" w:pos="1440"/>
+        </w:tabs>
+        <w:ind w:left="1440" w:hanging="360"/>
+      </w:pPr>
+      <w:rPr>
+        <w:rFonts w:ascii="Courier New" w:hAnsi="Courier New" w:hint="default"/>
+        <w:sz w:val="20"/>
+      </w:rPr>
+    </w:lvl>
+    <w:lvl w:ilvl="2" w:tentative="1">
+      <w:start w:val="1"/>
+      <w:numFmt w:val="bullet"/>
+      <w:lvlText w:val=""/>
+      <w:lvlJc w:val="left"/>
+      <w:pPr>
+        <w:tabs>
+          <w:tab w:val="num" w:pos="2160"/>
+        </w:tabs>
+        <w:ind w:left="2160" w:hanging="360"/>
+      </w:pPr>
+      <w:rPr>
+        <w:rFonts w:ascii="Wingdings" w:hAnsi="Wingdings" w:hint="default"/>
+        <w:sz w:val="20"/>
+      </w:rPr>
+    </w:lvl>
+    <w:lvl w:ilvl="3" w:tentative="1">
+      <w:start w:val="1"/>
+      <w:numFmt w:val="bullet"/>
+      <w:lvlText w:val=""/>
+      <w:lvlJc w:val="left"/>
+      <w:pPr>
+        <w:tabs>
+          <w:tab w:val="num" w:pos="2880"/>
+        </w:tabs>
+        <w:ind w:left="2880" w:hanging="360"/>
+      </w:pPr>
+      <w:rPr>
+        <w:rFonts w:ascii="Wingdings" w:hAnsi="Wingdings" w:hint="default"/>
+        <w:sz w:val="20"/>
+      </w:rPr>
+    </w:lvl>
+    <w:lvl w:ilvl="4" w:tentative="1">
+      <w:start w:val="1"/>
+      <w:numFmt w:val="bullet"/>
+      <w:lvlText w:val=""/>
+      <w:lvlJc w:val="left"/>
+      <w:pPr>
+        <w:tabs>
+          <w:tab w:val="num" w:pos="3600"/>
+        </w:tabs>
+        <w:ind w:left="3600" w:hanging="360"/>
+      </w:pPr>
+      <w:rPr>
+        <w:rFonts w:ascii="Wingdings" w:hAnsi="Wingdings" w:hint="default"/>
+        <w:sz w:val="20"/>
+      </w:rPr>
+    </w:lvl>
+    <w:lvl w:ilvl="5" w:tentative="1">
+      <w:start w:val="1"/>
+      <w:numFmt w:val="bullet"/>
+      <w:lvlText w:val=""/>
+      <w:lvlJc w:val="left"/>
+      <w:pPr>
+        <w:tabs>
+          <w:tab w:val="num" w:pos="4320"/>
+        </w:tabs>
+        <w:ind w:left="4320" w:hanging="360"/>
+      </w:pPr>
+      <w:rPr>
+        <w:rFonts w:ascii="Wingdings" w:hAnsi="Wingdings" w:hint="default"/>
+        <w:sz w:val="20"/>
+      </w:rPr>
+    </w:lvl>
+    <w:lvl w:ilvl="6" w:tentative="1">
+      <w:start w:val="1"/>
+      <w:numFmt w:val="bullet"/>
+      <w:lvlText w:val=""/>
+      <w:lvlJc w:val="left"/>
+      <w:pPr>
+        <w:tabs>
+          <w:tab w:val="num" w:pos="5040"/>
+        </w:tabs>
+        <w:ind w:left="5040" w:hanging="360"/>
+      </w:pPr>
+      <w:rPr>
+        <w:rFonts w:ascii="Wingdings" w:hAnsi="Wingdings" w:hint="default"/>
+        <w:sz w:val="20"/>
+      </w:rPr>
+    </w:lvl>
+    <w:lvl w:ilvl="7" w:tentative="1">
+      <w:start w:val="1"/>
+      <w:numFmt w:val="bullet"/>
+      <w:lvlText w:val=""/>
+      <w:lvlJc w:val="left"/>
+      <w:pPr>
+        <w:tabs>
+          <w:tab w:val="num" w:pos="5760"/>
+        </w:tabs>
+        <w:ind w:left="5760" w:hanging="360"/>
+      </w:pPr>
+      <w:rPr>
+        <w:rFonts w:ascii="Wingdings" w:hAnsi="Wingdings" w:hint="default"/>
+        <w:sz w:val="20"/>
+      </w:rPr>
+    </w:lvl>
+    <w:lvl w:ilvl="8" w:tentative="1">
+      <w:start w:val="1"/>
+      <w:numFmt w:val="bullet"/>
+      <w:lvlText w:val=""/>
+      <w:lvlJc w:val="left"/>
+      <w:pPr>
+        <w:tabs>
+          <w:tab w:val="num" w:pos="6480"/>
+        </w:tabs>
+        <w:ind w:left="6480" w:hanging="360"/>
+      </w:pPr>
+      <w:rPr>
+        <w:rFonts w:ascii="Wingdings" w:hAnsi="Wingdings" w:hint="default"/>
+        <w:sz w:val="20"/>
+      </w:rPr>
+    </w:lvl>
+  </w:abstractNum>
+  <w:abstractNum w:abstractNumId="2" w15:restartNumberingAfterBreak="0">
+    <w:nsid w:val="550735C0"/>
+    <w:multiLevelType w:val="multilevel"/>
+    <w:tmpl w:val="A334B14C"/>
+    <w:lvl w:ilvl="0">
+      <w:start w:val="1"/>
+      <w:numFmt w:val="bullet"/>
+      <w:lvlText w:val=""/>
+      <w:lvlJc w:val="left"/>
+      <w:pPr>
+        <w:tabs>
+          <w:tab w:val="num" w:pos="720"/>
+        </w:tabs>
+        <w:ind w:left="720" w:hanging="360"/>
+      </w:pPr>
+      <w:rPr>
+        <w:rFonts w:ascii="Symbol" w:hAnsi="Symbol" w:hint="default"/>
+        <w:sz w:val="20"/>
+      </w:rPr>
+    </w:lvl>
+    <w:lvl w:ilvl="1" w:tentative="1">
+      <w:start w:val="1"/>
+      <w:numFmt w:val="bullet"/>
+      <w:lvlText w:val="o"/>
+      <w:lvlJc w:val="left"/>
+      <w:pPr>
+        <w:tabs>
+          <w:tab w:val="num" w:pos="1440"/>
+        </w:tabs>
+        <w:ind w:left="1440" w:hanging="360"/>
+      </w:pPr>
+      <w:rPr>
+        <w:rFonts w:ascii="Courier New" w:hAnsi="Courier New" w:hint="default"/>
+        <w:sz w:val="20"/>
+      </w:rPr>
+    </w:lvl>
+    <w:lvl w:ilvl="2" w:tentative="1">
+      <w:start w:val="1"/>
+      <w:numFmt w:val="bullet"/>
+      <w:lvlText w:val=""/>
+      <w:lvlJc w:val="left"/>
+      <w:pPr>
+        <w:tabs>
+          <w:tab w:val="num" w:pos="2160"/>
+        </w:tabs>
+        <w:ind w:left="2160" w:hanging="360"/>
+      </w:pPr>
+      <w:rPr>
+        <w:rFonts w:ascii="Wingdings" w:hAnsi="Wingdings" w:hint="default"/>
+        <w:sz w:val="20"/>
+      </w:rPr>
+    </w:lvl>
+    <w:lvl w:ilvl="3" w:tentative="1">
+      <w:start w:val="1"/>
+      <w:numFmt w:val="bullet"/>
+      <w:lvlText w:val=""/>
+      <w:lvlJc w:val="left"/>
+      <w:pPr>
+        <w:tabs>
+          <w:tab w:val="num" w:pos="2880"/>
+        </w:tabs>
+        <w:ind w:left="2880" w:hanging="360"/>
+      </w:pPr>
+      <w:rPr>
+        <w:rFonts w:ascii="Wingdings" w:hAnsi="Wingdings" w:hint="default"/>
+        <w:sz w:val="20"/>
+      </w:rPr>
+    </w:lvl>
+    <w:lvl w:ilvl="4" w:tentative="1">
+      <w:start w:val="1"/>
+      <w:numFmt w:val="bullet"/>
+      <w:lvlText w:val=""/>
+      <w:lvlJc w:val="left"/>
+      <w:pPr>
+        <w:tabs>
+          <w:tab w:val="num" w:pos="3600"/>
+        </w:tabs>
+        <w:ind w:left="3600" w:hanging="360"/>
+      </w:pPr>
+      <w:rPr>
+        <w:rFonts w:ascii="Wingdings" w:hAnsi="Wingdings" w:hint="default"/>
+        <w:sz w:val="20"/>
+      </w:rPr>
+    </w:lvl>
+    <w:lvl w:ilvl="5" w:tentative="1">
+      <w:start w:val="1"/>
+      <w:numFmt w:val="bullet"/>
+      <w:lvlText w:val=""/>
+      <w:lvlJc w:val="left"/>
+      <w:pPr>
+        <w:tabs>
+          <w:tab w:val="num" w:pos="4320"/>
+        </w:tabs>
+        <w:ind w:left="4320" w:hanging="360"/>
+      </w:pPr>
+      <w:rPr>
+        <w:rFonts w:ascii="Wingdings" w:hAnsi="Wingdings" w:hint="default"/>
+        <w:sz w:val="20"/>
+      </w:rPr>
+    </w:lvl>
+    <w:lvl w:ilvl="6" w:tentative="1">
+      <w:start w:val="1"/>
+      <w:numFmt w:val="bullet"/>
+      <w:lvlText w:val=""/>
+      <w:lvlJc w:val="left"/>
+      <w:pPr>
+        <w:tabs>
+          <w:tab w:val="num" w:pos="5040"/>
+        </w:tabs>
+        <w:ind w:left="5040" w:hanging="360"/>
+      </w:pPr>
+      <w:rPr>
+        <w:rFonts w:ascii="Wingdings" w:hAnsi="Wingdings" w:hint="default"/>
+        <w:sz w:val="20"/>
+      </w:rPr>
+    </w:lvl>
+    <w:lvl w:ilvl="7" w:tentative="1">
+      <w:start w:val="1"/>
+      <w:numFmt w:val="bullet"/>
+      <w:lvlText w:val=""/>
+      <w:lvlJc w:val="left"/>
+      <w:pPr>
+        <w:tabs>
+          <w:tab w:val="num" w:pos="5760"/>
+        </w:tabs>
+        <w:ind w:left="5760" w:hanging="360"/>
+      </w:pPr>
+      <w:rPr>
+        <w:rFonts w:ascii="Wingdings" w:hAnsi="Wingdings" w:hint="default"/>
+        <w:sz w:val="20"/>
+      </w:rPr>
+    </w:lvl>
+    <w:lvl w:ilvl="8" w:tentative="1">
+      <w:start w:val="1"/>
+      <w:numFmt w:val="bullet"/>
+      <w:lvlText w:val=""/>
+      <w:lvlJc w:val="left"/>
+      <w:pPr>
+        <w:tabs>
+          <w:tab w:val="num" w:pos="6480"/>
+        </w:tabs>
+        <w:ind w:left="6480" w:hanging="360"/>
+      </w:pPr>
+      <w:rPr>
+        <w:rFonts w:ascii="Wingdings" w:hAnsi="Wingdings" w:hint="default"/>
+        <w:sz w:val="20"/>
+      </w:rPr>
+    </w:lvl>
+  </w:abstractNum>
+  <w:abstractNum w:abstractNumId="3" w15:restartNumberingAfterBreak="0">
     <w:nsid w:val="602230C7"/>
     <w:multiLevelType w:val="multilevel"/>
     <w:tmpl w:val="EFF89B92"/>
@@ -862,7 +1835,7 @@
       </w:rPr>
     </w:lvl>
   </w:abstractNum>
-  <w:abstractNum w:abstractNumId="1" w15:restartNumberingAfterBreak="0">
+  <w:abstractNum w:abstractNumId="4" w15:restartNumberingAfterBreak="0">
     <w:nsid w:val="72277FBE"/>
     <w:multiLevelType w:val="multilevel"/>
     <w:tmpl w:val="F50EB84A"/>
@@ -1011,7 +1984,7 @@
       </w:rPr>
     </w:lvl>
   </w:abstractNum>
-  <w:abstractNum w:abstractNumId="2" w15:restartNumberingAfterBreak="0">
+  <w:abstractNum w:abstractNumId="5" w15:restartNumberingAfterBreak="0">
     <w:nsid w:val="731A7F7B"/>
     <w:multiLevelType w:val="multilevel"/>
     <w:tmpl w:val="CC56A3BA"/>
@@ -1160,7 +2133,7 @@
       </w:rPr>
     </w:lvl>
   </w:abstractNum>
-  <w:abstractNum w:abstractNumId="3" w15:restartNumberingAfterBreak="0">
+  <w:abstractNum w:abstractNumId="6" w15:restartNumberingAfterBreak="0">
     <w:nsid w:val="75BB47BF"/>
     <w:multiLevelType w:val="multilevel"/>
     <w:tmpl w:val="53B26BD2"/>
@@ -1310,16 +2283,25 @@
     </w:lvl>
   </w:abstractNum>
   <w:num w:numId="1" w16cid:durableId="1807157444">
+    <w:abstractNumId w:val="3"/>
+  </w:num>
+  <w:num w:numId="2" w16cid:durableId="814878092">
+    <w:abstractNumId w:val="4"/>
+  </w:num>
+  <w:num w:numId="3" w16cid:durableId="1493175462">
+    <w:abstractNumId w:val="5"/>
+  </w:num>
+  <w:num w:numId="4" w16cid:durableId="2089963244">
+    <w:abstractNumId w:val="6"/>
+  </w:num>
+  <w:num w:numId="5" w16cid:durableId="1804228442">
     <w:abstractNumId w:val="0"/>
   </w:num>
-  <w:num w:numId="2" w16cid:durableId="814878092">
-    <w:abstractNumId w:val="1"/>
-  </w:num>
-  <w:num w:numId="3" w16cid:durableId="1493175462">
+  <w:num w:numId="6" w16cid:durableId="836381710">
     <w:abstractNumId w:val="2"/>
   </w:num>
-  <w:num w:numId="4" w16cid:durableId="2089963244">
-    <w:abstractNumId w:val="3"/>
+  <w:num w:numId="7" w16cid:durableId="1161966786">
+    <w:abstractNumId w:val="1"/>
   </w:num>
 </w:numbering>
 </file>

</xml_diff>

<commit_message>
feat: integrate full ETL pipeline, implement batch sentiment analysis and BQ idempotency
</commit_message>
<xml_diff>
--- a/progress/Diario de Trabajo.docx
+++ b/progress/Diario de Trabajo.docx
@@ -87,18 +87,13 @@
         <w:t>Configuración de Entorno Seguro:</w:t>
       </w:r>
       <w:r>
-        <w:t xml:space="preserve"> Creamos un entorno protegido mediante el </w:t>
-      </w:r>
-      <w:proofErr w:type="gramStart"/>
-      <w:r>
-        <w:t>archivo .</w:t>
+        <w:t xml:space="preserve"> Creamos un entorno protegido mediante el archivo .</w:t>
       </w:r>
       <w:proofErr w:type="spellStart"/>
       <w:r>
         <w:t>env</w:t>
       </w:r>
       <w:proofErr w:type="spellEnd"/>
-      <w:proofErr w:type="gramEnd"/>
       <w:r>
         <w:t xml:space="preserve"> y la librería </w:t>
       </w:r>
@@ -242,15 +237,7 @@
       </w:r>
       <w:proofErr w:type="spellEnd"/>
       <w:r>
-        <w:t xml:space="preserve"> </w:t>
-      </w:r>
-      <w:proofErr w:type="gramStart"/>
-      <w:r>
-        <w:t>show</w:t>
-      </w:r>
-      <w:proofErr w:type="gramEnd"/>
-      <w:r>
-        <w:t>) para registrarla correctamente en el requirements.txt.</w:t>
+        <w:t xml:space="preserve"> show) para registrarla correctamente en el requirements.txt.</w:t>
       </w:r>
     </w:p>
     <w:p>
@@ -276,15 +263,7 @@
       </w:r>
       <w:proofErr w:type="spellEnd"/>
       <w:r>
-        <w:t xml:space="preserve"> y comentarios en inglés a todo el script, subiendo el nivel del código a un estándar profesional para tu </w:t>
-      </w:r>
-      <w:proofErr w:type="gramStart"/>
-      <w:r>
-        <w:t>portfolio</w:t>
-      </w:r>
-      <w:proofErr w:type="gramEnd"/>
-      <w:r>
-        <w:t>.</w:t>
+        <w:t xml:space="preserve"> y comentarios en inglés a todo el script, subiendo el nivel del código a un estándar profesional para tu portfolio.</w:t>
       </w:r>
     </w:p>
     <w:p>
@@ -388,31 +367,15 @@
         <w:t xml:space="preserve"> de Índices:</w:t>
       </w:r>
       <w:r>
-        <w:t xml:space="preserve"> Descubrimos por qué y cómo </w:t>
-      </w:r>
-      <w:proofErr w:type="gramStart"/>
-      <w:r>
-        <w:t>usar .</w:t>
-      </w:r>
-      <w:proofErr w:type="spellStart"/>
-      <w:r>
-        <w:t>reset</w:t>
-      </w:r>
-      <w:proofErr w:type="gramEnd"/>
-      <w:r>
-        <w:t>_</w:t>
-      </w:r>
-      <w:proofErr w:type="gramStart"/>
-      <w:r>
-        <w:t>index</w:t>
-      </w:r>
-      <w:proofErr w:type="spellEnd"/>
-      <w:r>
-        <w:t>(</w:t>
-      </w:r>
-      <w:proofErr w:type="gramEnd"/>
-      <w:r>
-        <w:t>) para convertir fechas ocultas en los márgenes de la tabla a columnas estándar, preparando el terreno para los cruces de la Fase 2.</w:t>
+        <w:t xml:space="preserve"> Descubrimos por qué y cómo usar .</w:t>
+      </w:r>
+      <w:proofErr w:type="spellStart"/>
+      <w:r>
+        <w:t>reset_index</w:t>
+      </w:r>
+      <w:proofErr w:type="spellEnd"/>
+      <w:r>
+        <w:t>() para convertir fechas ocultas en los márgenes de la tabla a columnas estándar, preparando el terreno para los cruces de la Fase 2.</w:t>
       </w:r>
     </w:p>
     <w:p>
@@ -526,18 +489,13 @@
         <w:t xml:space="preserve"> JSON:</w:t>
       </w:r>
       <w:r>
-        <w:t xml:space="preserve"> </w:t>
-      </w:r>
-      <w:proofErr w:type="gramStart"/>
-      <w:r>
-        <w:t>Usamos .</w:t>
+        <w:t xml:space="preserve"> Usamos .</w:t>
       </w:r>
       <w:proofErr w:type="spellStart"/>
       <w:r>
         <w:t>json</w:t>
       </w:r>
       <w:proofErr w:type="spellEnd"/>
-      <w:proofErr w:type="gramEnd"/>
       <w:r>
         <w:t>() para transformar la respuesta cruda de internet en un diccionario nativo de Python fácilmente manipulable.</w:t>
       </w:r>
@@ -827,15 +785,7 @@
         <w:t>3</w:t>
       </w:r>
       <w:r>
-        <w:t>.5-</w:t>
-      </w:r>
-      <w:proofErr w:type="gramStart"/>
-      <w:r>
-        <w:t>flash</w:t>
-      </w:r>
-      <w:proofErr w:type="gramEnd"/>
-      <w:r>
-        <w:t xml:space="preserve"> debido a su óptimo equilibrio entre latencia (velocidad) y coste, ideal para el procesamiento de volúmenes de datos financieros diarios.</w:t>
+        <w:t>.5-flash debido a su óptimo equilibrio entre latencia (velocidad) y coste, ideal para el procesamiento de volúmenes de datos financieros diarios.</w:t>
       </w:r>
     </w:p>
     <w:p>
@@ -1034,21 +984,12 @@
       <w:r>
         <w:t xml:space="preserve"> He aprendido que el mayor riesgo en el análisis financiero es el </w:t>
       </w:r>
-      <w:proofErr w:type="gramStart"/>
       <w:r>
         <w:rPr>
           <w:i/>
           <w:iCs/>
         </w:rPr>
-        <w:t>Look</w:t>
-      </w:r>
-      <w:proofErr w:type="gramEnd"/>
-      <w:r>
-        <w:rPr>
-          <w:i/>
-          <w:iCs/>
-        </w:rPr>
-        <w:t>-</w:t>
+        <w:t>Look-</w:t>
       </w:r>
       <w:proofErr w:type="spellStart"/>
       <w:r>
@@ -1210,6 +1151,71 @@
         <w:rPr>
           <w:b/>
           <w:bCs/>
+          <w:noProof/>
+        </w:rPr>
+        <mc:AlternateContent>
+          <mc:Choice Requires="wps">
+            <w:drawing>
+              <wp:anchor distT="0" distB="0" distL="114300" distR="114300" simplePos="0" relativeHeight="251660288" behindDoc="0" locked="0" layoutInCell="1" allowOverlap="1" wp14:anchorId="179A1528" wp14:editId="521D83D6">
+                <wp:simplePos x="0" y="0"/>
+                <wp:positionH relativeFrom="column">
+                  <wp:posOffset>-118110</wp:posOffset>
+                </wp:positionH>
+                <wp:positionV relativeFrom="paragraph">
+                  <wp:posOffset>333375</wp:posOffset>
+                </wp:positionV>
+                <wp:extent cx="5524500" cy="28575"/>
+                <wp:effectExtent l="0" t="0" r="19050" b="28575"/>
+                <wp:wrapNone/>
+                <wp:docPr id="527821176" name="Conector recto 2"/>
+                <wp:cNvGraphicFramePr/>
+                <a:graphic xmlns:a="http://schemas.openxmlformats.org/drawingml/2006/main">
+                  <a:graphicData uri="http://schemas.microsoft.com/office/word/2010/wordprocessingShape">
+                    <wps:wsp>
+                      <wps:cNvCnPr/>
+                      <wps:spPr>
+                        <a:xfrm flipV="1">
+                          <a:off x="0" y="0"/>
+                          <a:ext cx="5524500" cy="28575"/>
+                        </a:xfrm>
+                        <a:prstGeom prst="line">
+                          <a:avLst/>
+                        </a:prstGeom>
+                      </wps:spPr>
+                      <wps:style>
+                        <a:lnRef idx="2">
+                          <a:schemeClr val="accent1"/>
+                        </a:lnRef>
+                        <a:fillRef idx="0">
+                          <a:schemeClr val="accent1"/>
+                        </a:fillRef>
+                        <a:effectRef idx="1">
+                          <a:schemeClr val="accent1"/>
+                        </a:effectRef>
+                        <a:fontRef idx="minor">
+                          <a:schemeClr val="tx1"/>
+                        </a:fontRef>
+                      </wps:style>
+                      <wps:bodyPr/>
+                    </wps:wsp>
+                  </a:graphicData>
+                </a:graphic>
+              </wp:anchor>
+            </w:drawing>
+          </mc:Choice>
+          <mc:Fallback>
+            <w:pict>
+              <v:line w14:anchorId="3F3FAAFA" id="Conector recto 2" o:spid="_x0000_s1026" style="position:absolute;flip:y;z-index:251660288;visibility:visible;mso-wrap-style:square;mso-wrap-distance-left:9pt;mso-wrap-distance-top:0;mso-wrap-distance-right:9pt;mso-wrap-distance-bottom:0;mso-position-horizontal:absolute;mso-position-horizontal-relative:text;mso-position-vertical:absolute;mso-position-vertical-relative:text" from="-9.3pt,26.25pt" to="425.7pt,28.5pt" o:gfxdata="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" strokecolor="#156082 [3204]" strokeweight="1.5pt">
+                <v:stroke joinstyle="miter"/>
+              </v:line>
+            </w:pict>
+          </mc:Fallback>
+        </mc:AlternateContent>
+      </w:r>
+      <w:r>
+        <w:rPr>
+          <w:b/>
+          <w:bCs/>
         </w:rPr>
         <w:t>Load:</w:t>
       </w:r>
@@ -1218,6 +1224,616 @@
       </w:r>
     </w:p>
     <w:p/>
+    <w:p>
+      <w:pPr>
+        <w:rPr>
+          <w:b/>
+          <w:bCs/>
+        </w:rPr>
+      </w:pPr>
+      <w:r>
+        <w:rPr>
+          <w:b/>
+          <w:bCs/>
+        </w:rPr>
+        <w:t>12/07/2026</w:t>
+      </w:r>
+      <w:r>
+        <w:rPr>
+          <w:b/>
+          <w:bCs/>
+        </w:rPr>
+        <w:t xml:space="preserve"> – </w:t>
+      </w:r>
+      <w:r>
+        <w:rPr>
+          <w:b/>
+          <w:bCs/>
+        </w:rPr>
+        <w:t>19:46</w:t>
+      </w:r>
+    </w:p>
+    <w:p>
+      <w:r>
+        <w:rPr>
+          <w:b/>
+          <w:bCs/>
+        </w:rPr>
+        <w:t>Objetivo de la sesión:</w:t>
+      </w:r>
+      <w:r>
+        <w:t xml:space="preserve"> Asegurar la persistencia de datos mediante una carga robusta en </w:t>
+      </w:r>
+      <w:proofErr w:type="spellStart"/>
+      <w:r>
+        <w:t>BigQuery</w:t>
+      </w:r>
+      <w:proofErr w:type="spellEnd"/>
+      <w:r>
+        <w:t>, orquestar el flujo completo del pipeline y optimizar la comunicación con la IA.</w:t>
+      </w:r>
+    </w:p>
+    <w:p>
+      <w:pPr>
+        <w:rPr>
+          <w:b/>
+          <w:bCs/>
+        </w:rPr>
+      </w:pPr>
+      <w:r>
+        <w:rPr>
+          <w:b/>
+          <w:bCs/>
+        </w:rPr>
+        <w:t>1. Implementación de Idempotencia en load.py</w:t>
+      </w:r>
+    </w:p>
+    <w:p>
+      <w:pPr>
+        <w:numPr>
+          <w:ilvl w:val="0"/>
+          <w:numId w:val="8"/>
+        </w:numPr>
+      </w:pPr>
+      <w:r>
+        <w:rPr>
+          <w:b/>
+          <w:bCs/>
+        </w:rPr>
+        <w:t>Reto:</w:t>
+      </w:r>
+      <w:r>
+        <w:t xml:space="preserve"> Evitar registros duplicados en </w:t>
+      </w:r>
+      <w:proofErr w:type="spellStart"/>
+      <w:r>
+        <w:t>BigQuery</w:t>
+      </w:r>
+      <w:proofErr w:type="spellEnd"/>
+      <w:r>
+        <w:t xml:space="preserve"> al ejecutar el pipeline varias veces (evitar el impacto de múltiples ejecuciones diarias).</w:t>
+      </w:r>
+    </w:p>
+    <w:p>
+      <w:pPr>
+        <w:numPr>
+          <w:ilvl w:val="0"/>
+          <w:numId w:val="8"/>
+        </w:numPr>
+      </w:pPr>
+      <w:r>
+        <w:rPr>
+          <w:b/>
+          <w:bCs/>
+        </w:rPr>
+        <w:t>Solución:</w:t>
+      </w:r>
+      <w:r>
+        <w:t xml:space="preserve"> Implementamos una lógica de "Delete &amp; </w:t>
+      </w:r>
+      <w:proofErr w:type="spellStart"/>
+      <w:r>
+        <w:t>Append</w:t>
+      </w:r>
+      <w:proofErr w:type="spellEnd"/>
+      <w:r>
+        <w:t>". El script ahora ejecuta una sentencia DELETE filtrada por Ticker y Date antes de insertar los nuevos datos, garantizando que siempre exista una versión única de la verdad.</w:t>
+      </w:r>
+    </w:p>
+    <w:p>
+      <w:pPr>
+        <w:numPr>
+          <w:ilvl w:val="0"/>
+          <w:numId w:val="8"/>
+        </w:numPr>
+      </w:pPr>
+      <w:r>
+        <w:rPr>
+          <w:b/>
+          <w:bCs/>
+        </w:rPr>
+        <w:t>Deuda Técnica Consciente:</w:t>
+      </w:r>
+      <w:r>
+        <w:t xml:space="preserve"> Dado que las operaciones DML requieren facturación activa en GCP, documentamos la ejecución como "deuda </w:t>
+      </w:r>
+      <w:r>
+        <w:lastRenderedPageBreak/>
+        <w:t xml:space="preserve">técnica consciente" mediante comentarios en inglés, manteniendo la lógica lista pero comentada para el entorno </w:t>
+      </w:r>
+      <w:r>
+        <w:rPr>
+          <w:i/>
+          <w:iCs/>
+        </w:rPr>
+        <w:t>Free Tier</w:t>
+      </w:r>
+      <w:r>
+        <w:t>.</w:t>
+      </w:r>
+    </w:p>
+    <w:p>
+      <w:pPr>
+        <w:rPr>
+          <w:b/>
+          <w:bCs/>
+        </w:rPr>
+      </w:pPr>
+      <w:r>
+        <w:rPr>
+          <w:b/>
+          <w:bCs/>
+        </w:rPr>
+        <w:t>2. Orquestación Centralizada (main.py)</w:t>
+      </w:r>
+    </w:p>
+    <w:p>
+      <w:pPr>
+        <w:numPr>
+          <w:ilvl w:val="0"/>
+          <w:numId w:val="9"/>
+        </w:numPr>
+      </w:pPr>
+      <w:r>
+        <w:rPr>
+          <w:b/>
+          <w:bCs/>
+        </w:rPr>
+        <w:t>Estructura:</w:t>
+      </w:r>
+      <w:r>
+        <w:t xml:space="preserve"> Creamos el archivo src/main.py para coordinar el ciclo completo: </w:t>
+      </w:r>
+      <w:proofErr w:type="spellStart"/>
+      <w:r>
+        <w:t>extract</w:t>
+      </w:r>
+      <w:proofErr w:type="spellEnd"/>
+      <w:r>
+        <w:t xml:space="preserve"> → </w:t>
+      </w:r>
+      <w:proofErr w:type="spellStart"/>
+      <w:r>
+        <w:t>transform</w:t>
+      </w:r>
+      <w:proofErr w:type="spellEnd"/>
+      <w:r>
+        <w:t xml:space="preserve"> → load.</w:t>
+      </w:r>
+    </w:p>
+    <w:p>
+      <w:pPr>
+        <w:numPr>
+          <w:ilvl w:val="0"/>
+          <w:numId w:val="9"/>
+        </w:numPr>
+      </w:pPr>
+      <w:r>
+        <w:rPr>
+          <w:b/>
+          <w:bCs/>
+        </w:rPr>
+        <w:t>Robustez:</w:t>
+      </w:r>
+      <w:r>
+        <w:t xml:space="preserve"> Implementamos una función orquestadora </w:t>
+      </w:r>
+      <w:proofErr w:type="spellStart"/>
+      <w:r>
+        <w:t>run_etl_pipeline</w:t>
+      </w:r>
+      <w:proofErr w:type="spellEnd"/>
+      <w:r>
+        <w:t xml:space="preserve"> con gestión de errores (bloques try/</w:t>
+      </w:r>
+      <w:proofErr w:type="spellStart"/>
+      <w:r>
+        <w:t>except</w:t>
+      </w:r>
+      <w:proofErr w:type="spellEnd"/>
+      <w:r>
+        <w:t>), lo que permite que el sistema continúe funcionando incluso si una fase individual (como el análisis de sentimiento) falla.</w:t>
+      </w:r>
+    </w:p>
+    <w:p>
+      <w:pPr>
+        <w:rPr>
+          <w:b/>
+          <w:bCs/>
+        </w:rPr>
+      </w:pPr>
+      <w:r>
+        <w:rPr>
+          <w:b/>
+          <w:bCs/>
+        </w:rPr>
+        <w:t>3. Optimización del Flujo de IA (Solución del error 429)</w:t>
+      </w:r>
+    </w:p>
+    <w:p>
+      <w:pPr>
+        <w:numPr>
+          <w:ilvl w:val="0"/>
+          <w:numId w:val="10"/>
+        </w:numPr>
+      </w:pPr>
+      <w:r>
+        <w:rPr>
+          <w:b/>
+          <w:bCs/>
+        </w:rPr>
+        <w:t>Reto:</w:t>
+      </w:r>
+      <w:r>
+        <w:t xml:space="preserve"> El pipeline chocaba contra el límite de velocidad (Rate </w:t>
+      </w:r>
+      <w:proofErr w:type="spellStart"/>
+      <w:r>
+        <w:t>Limit</w:t>
+      </w:r>
+      <w:proofErr w:type="spellEnd"/>
+      <w:r>
+        <w:t>) de la API de Gemini al realizar peticiones individuales por cada titular (1800+ titulares).</w:t>
+      </w:r>
+    </w:p>
+    <w:p>
+      <w:pPr>
+        <w:numPr>
+          <w:ilvl w:val="0"/>
+          <w:numId w:val="10"/>
+        </w:numPr>
+      </w:pPr>
+      <w:r>
+        <w:rPr>
+          <w:b/>
+          <w:bCs/>
+        </w:rPr>
+        <w:t>Solución (</w:t>
+      </w:r>
+      <w:proofErr w:type="spellStart"/>
+      <w:r>
+        <w:rPr>
+          <w:b/>
+          <w:bCs/>
+        </w:rPr>
+        <w:t>Batching</w:t>
+      </w:r>
+      <w:proofErr w:type="spellEnd"/>
+      <w:r>
+        <w:rPr>
+          <w:b/>
+          <w:bCs/>
+        </w:rPr>
+        <w:t>):</w:t>
+      </w:r>
+      <w:r>
+        <w:t xml:space="preserve"> Eliminamos el bucle </w:t>
+      </w:r>
+      <w:proofErr w:type="spellStart"/>
+      <w:r>
+        <w:t>for</w:t>
+      </w:r>
+      <w:proofErr w:type="spellEnd"/>
+      <w:r>
+        <w:t xml:space="preserve"> y refactorizamos </w:t>
+      </w:r>
+      <w:proofErr w:type="spellStart"/>
+      <w:r>
+        <w:t>analyze_sentiment</w:t>
+      </w:r>
+      <w:proofErr w:type="spellEnd"/>
+      <w:r>
+        <w:t>. Ahora enviamos todos los titulares agrupados en un solo bloque de texto mediante un "</w:t>
+      </w:r>
+      <w:proofErr w:type="spellStart"/>
+      <w:r>
+        <w:t>prompt</w:t>
+      </w:r>
+      <w:proofErr w:type="spellEnd"/>
+      <w:r>
+        <w:t xml:space="preserve"> maestro".</w:t>
+      </w:r>
+    </w:p>
+    <w:p>
+      <w:pPr>
+        <w:numPr>
+          <w:ilvl w:val="0"/>
+          <w:numId w:val="10"/>
+        </w:numPr>
+      </w:pPr>
+      <w:r>
+        <w:rPr>
+          <w:b/>
+          <w:bCs/>
+        </w:rPr>
+        <w:t>Resultado:</w:t>
+      </w:r>
+      <w:r>
+        <w:t xml:space="preserve"> Reducción de cientos de peticiones a una sola por ejecución, optimizando la cuota gratuita y permitiendo un análisis global más coherente.</w:t>
+      </w:r>
+    </w:p>
+    <w:p>
+      <w:pPr>
+        <w:rPr>
+          <w:b/>
+          <w:bCs/>
+        </w:rPr>
+      </w:pPr>
+      <w:r>
+        <w:rPr>
+          <w:b/>
+          <w:bCs/>
+        </w:rPr>
+        <w:t>4. Depuración e Integración Final</w:t>
+      </w:r>
+    </w:p>
+    <w:p>
+      <w:pPr>
+        <w:numPr>
+          <w:ilvl w:val="0"/>
+          <w:numId w:val="11"/>
+        </w:numPr>
+      </w:pPr>
+      <w:r>
+        <w:rPr>
+          <w:b/>
+          <w:bCs/>
+        </w:rPr>
+        <w:t>Resolución de Conflictos:</w:t>
+      </w:r>
+      <w:r>
+        <w:t xml:space="preserve"> Corregimos errores de nombres de variables en </w:t>
+      </w:r>
+      <w:proofErr w:type="spellStart"/>
+      <w:r>
+        <w:t>merge_data</w:t>
+      </w:r>
+      <w:proofErr w:type="spellEnd"/>
+      <w:r>
+        <w:t xml:space="preserve"> y sincronizamos los esquemas de datos entre el </w:t>
+      </w:r>
+      <w:proofErr w:type="spellStart"/>
+      <w:r>
+        <w:t>DataFrame</w:t>
+      </w:r>
+      <w:proofErr w:type="spellEnd"/>
+      <w:r>
+        <w:t xml:space="preserve"> local y la tabla de </w:t>
+      </w:r>
+      <w:proofErr w:type="spellStart"/>
+      <w:r>
+        <w:t>BigQuery</w:t>
+      </w:r>
+      <w:proofErr w:type="spellEnd"/>
+      <w:r>
+        <w:t xml:space="preserve"> para evitar rechazos de carga.</w:t>
+      </w:r>
+    </w:p>
+    <w:p>
+      <w:pPr>
+        <w:numPr>
+          <w:ilvl w:val="0"/>
+          <w:numId w:val="11"/>
+        </w:numPr>
+      </w:pPr>
+      <w:r>
+        <w:rPr>
+          <w:b/>
+          <w:bCs/>
+        </w:rPr>
+        <w:t>Consolidación:</w:t>
+      </w:r>
+      <w:r>
+        <w:t xml:space="preserve"> El pipeline ahora carga la columna </w:t>
+      </w:r>
+      <w:proofErr w:type="spellStart"/>
+      <w:r>
+        <w:t>Sentiment</w:t>
+      </w:r>
+      <w:proofErr w:type="spellEnd"/>
+      <w:r>
+        <w:t xml:space="preserve"> calculada exitosamente en la tabla de la nube.</w:t>
+      </w:r>
+    </w:p>
+    <w:p>
+      <w:pPr>
+        <w:rPr>
+          <w:b/>
+          <w:bCs/>
+        </w:rPr>
+      </w:pPr>
+      <w:r>
+        <w:rPr>
+          <w:b/>
+          <w:bCs/>
+        </w:rPr>
+        <w:t>5. Gestión de Repositorio y Git</w:t>
+      </w:r>
+    </w:p>
+    <w:p>
+      <w:pPr>
+        <w:numPr>
+          <w:ilvl w:val="0"/>
+          <w:numId w:val="12"/>
+        </w:numPr>
+      </w:pPr>
+      <w:r>
+        <w:rPr>
+          <w:b/>
+          <w:bCs/>
+        </w:rPr>
+        <w:t>Seguridad:</w:t>
+      </w:r>
+      <w:r>
+        <w:t xml:space="preserve"> Configuramos </w:t>
+      </w:r>
+      <w:proofErr w:type="spellStart"/>
+      <w:r>
+        <w:t>el</w:t>
+      </w:r>
+      <w:proofErr w:type="spellEnd"/>
+      <w:r>
+        <w:t xml:space="preserve"> .</w:t>
+      </w:r>
+      <w:proofErr w:type="spellStart"/>
+      <w:r>
+        <w:t>gitignore</w:t>
+      </w:r>
+      <w:proofErr w:type="spellEnd"/>
+      <w:r>
+        <w:t xml:space="preserve"> para excluir archivos sensibles (.</w:t>
+      </w:r>
+      <w:proofErr w:type="spellStart"/>
+      <w:r>
+        <w:t>env</w:t>
+      </w:r>
+      <w:proofErr w:type="spellEnd"/>
+      <w:r>
+        <w:t>, claves .</w:t>
+      </w:r>
+      <w:proofErr w:type="spellStart"/>
+      <w:r>
+        <w:t>json</w:t>
+      </w:r>
+      <w:proofErr w:type="spellEnd"/>
+      <w:r>
+        <w:t>) y archivos temporales (</w:t>
+      </w:r>
+      <w:proofErr w:type="spellStart"/>
+      <w:r>
+        <w:t>venv</w:t>
+      </w:r>
+      <w:proofErr w:type="spellEnd"/>
+      <w:r>
+        <w:t>/, __</w:t>
+      </w:r>
+      <w:proofErr w:type="spellStart"/>
+      <w:r>
+        <w:t>pycache</w:t>
+      </w:r>
+      <w:proofErr w:type="spellEnd"/>
+      <w:r>
+        <w:t>__/).</w:t>
+      </w:r>
+    </w:p>
+    <w:p>
+      <w:pPr>
+        <w:numPr>
+          <w:ilvl w:val="0"/>
+          <w:numId w:val="12"/>
+        </w:numPr>
+      </w:pPr>
+      <w:r>
+        <w:rPr>
+          <w:b/>
+          <w:bCs/>
+        </w:rPr>
+        <w:t>Control de versiones:</w:t>
+      </w:r>
+      <w:r>
+        <w:t xml:space="preserve"> Realizamos un </w:t>
+      </w:r>
+      <w:proofErr w:type="spellStart"/>
+      <w:r>
+        <w:rPr>
+          <w:i/>
+          <w:iCs/>
+        </w:rPr>
+        <w:t>push</w:t>
+      </w:r>
+      <w:proofErr w:type="spellEnd"/>
+      <w:r>
+        <w:t xml:space="preserve"> final con un </w:t>
+      </w:r>
+      <w:proofErr w:type="spellStart"/>
+      <w:r>
+        <w:rPr>
+          <w:i/>
+          <w:iCs/>
+        </w:rPr>
+        <w:t>commit</w:t>
+      </w:r>
+      <w:proofErr w:type="spellEnd"/>
+      <w:r>
+        <w:t xml:space="preserve"> profesional siguiendo estándares de la industria (</w:t>
+      </w:r>
+      <w:proofErr w:type="spellStart"/>
+      <w:r>
+        <w:t>feat</w:t>
+      </w:r>
+      <w:proofErr w:type="spellEnd"/>
+      <w:r>
+        <w:t xml:space="preserve">: </w:t>
+      </w:r>
+      <w:proofErr w:type="spellStart"/>
+      <w:r>
+        <w:t>implement</w:t>
+      </w:r>
+      <w:proofErr w:type="spellEnd"/>
+      <w:r>
+        <w:t xml:space="preserve"> </w:t>
+      </w:r>
+      <w:proofErr w:type="spellStart"/>
+      <w:r>
+        <w:t>BigQuery</w:t>
+      </w:r>
+      <w:proofErr w:type="spellEnd"/>
+      <w:r>
+        <w:t xml:space="preserve"> load </w:t>
+      </w:r>
+      <w:proofErr w:type="spellStart"/>
+      <w:r>
+        <w:t>layer</w:t>
+      </w:r>
+      <w:proofErr w:type="spellEnd"/>
+      <w:r>
+        <w:t xml:space="preserve"> </w:t>
+      </w:r>
+      <w:proofErr w:type="spellStart"/>
+      <w:r>
+        <w:t>with</w:t>
+      </w:r>
+      <w:proofErr w:type="spellEnd"/>
+      <w:r>
+        <w:t xml:space="preserve"> </w:t>
+      </w:r>
+      <w:proofErr w:type="spellStart"/>
+      <w:r>
+        <w:t>idempotency</w:t>
+      </w:r>
+      <w:proofErr w:type="spellEnd"/>
+      <w:r>
+        <w:t xml:space="preserve"> </w:t>
+      </w:r>
+      <w:proofErr w:type="spellStart"/>
+      <w:r>
+        <w:t>logic</w:t>
+      </w:r>
+      <w:proofErr w:type="spellEnd"/>
+      <w:r>
+        <w:t>), garantizando que la historia de cambios sea clara y estructurada.</w:t>
+      </w:r>
+    </w:p>
     <w:p/>
     <w:p/>
     <w:p>
@@ -1240,6 +1856,453 @@
 <file path=word/numbering.xml><?xml version="1.0" encoding="utf-8"?>
 <w:numbering xmlns:wpc="http://schemas.microsoft.com/office/word/2010/wordprocessingCanvas" xmlns:cx="http://schemas.microsoft.com/office/drawing/2014/chartex" xmlns:cx1="http://schemas.microsoft.com/office/drawing/2015/9/8/chartex" xmlns:cx2="http://schemas.microsoft.com/office/drawing/2015/10/21/chartex" xmlns:cx3="http://schemas.microsoft.com/office/drawing/2016/5/9/chartex" xmlns:cx4="http://schemas.microsoft.com/office/drawing/2016/5/10/chartex" xmlns:cx5="http://schemas.microsoft.com/office/drawing/2016/5/11/chartex" xmlns:cx6="http://schemas.microsoft.com/office/drawing/2016/5/12/chartex" xmlns:cx7="http://schemas.microsoft.com/office/drawing/2016/5/13/chartex" xmlns:cx8="http://schemas.microsoft.com/office/drawing/2016/5/14/chartex" xmlns:mc="http://schemas.openxmlformats.org/markup-compatibility/2006" xmlns:aink="http://schemas.microsoft.com/office/drawing/2016/ink" xmlns:am3d="http://schemas.microsoft.com/office/drawing/2017/model3d" xmlns:o="urn:schemas-microsoft-com:office:office" xmlns:oel="http://schemas.microsoft.com/office/2019/extlst" xmlns:r="http://schemas.openxmlformats.org/officeDocument/2006/relationships" xmlns:m="http://schemas.openxmlformats.org/officeDocument/2006/math" xmlns:v="urn:schemas-microsoft-com:vml" xmlns:wp14="http://schemas.microsoft.com/office/word/2010/wordprocessingDrawing" xmlns:wp="http://schemas.openxmlformats.org/drawingml/2006/wordprocessingDrawing" xmlns:w10="urn:schemas-microsoft-com:office:word" xmlns:w="http://schemas.openxmlformats.org/wordprocessingml/2006/main" xmlns:w14="http://schemas.microsoft.com/office/word/2010/wordml" xmlns:w15="http://schemas.microsoft.com/office/word/2012/wordml" xmlns:w16cex="http://schemas.microsoft.com/office/word/2018/wordml/cex" xmlns:w16cid="http://schemas.microsoft.com/office/word/2016/wordml/cid" xmlns:w16="http://schemas.microsoft.com/office/word/2018/wordml" xmlns:w16du="http://schemas.microsoft.com/office/word/2023/wordml/word16du" xmlns:w16sdtdh="http://schemas.microsoft.com/office/word/2020/wordml/sdtdatahash" xmlns:w16sdtfl="http://schemas.microsoft.com/office/word/2024/wordml/sdtformatlock" xmlns:w16se="http://schemas.microsoft.com/office/word/2015/wordml/symex" xmlns:wpg="http://schemas.microsoft.com/office/word/2010/wordprocessingGroup" xmlns:wpi="http://schemas.microsoft.com/office/word/2010/wordprocessingInk" xmlns:wne="http://schemas.microsoft.com/office/word/2006/wordml" xmlns:wps="http://schemas.microsoft.com/office/word/2010/wordprocessingShape" mc:Ignorable="w14 w15 w16se w16cid w16 w16cex w16sdtdh w16sdtfl w16du wp14">
   <w:abstractNum w:abstractNumId="0" w15:restartNumberingAfterBreak="0">
+    <w:nsid w:val="1B181BD3"/>
+    <w:multiLevelType w:val="multilevel"/>
+    <w:tmpl w:val="5030D106"/>
+    <w:lvl w:ilvl="0">
+      <w:start w:val="1"/>
+      <w:numFmt w:val="bullet"/>
+      <w:lvlText w:val=""/>
+      <w:lvlJc w:val="left"/>
+      <w:pPr>
+        <w:tabs>
+          <w:tab w:val="num" w:pos="720"/>
+        </w:tabs>
+        <w:ind w:left="720" w:hanging="360"/>
+      </w:pPr>
+      <w:rPr>
+        <w:rFonts w:ascii="Symbol" w:hAnsi="Symbol" w:hint="default"/>
+        <w:sz w:val="20"/>
+      </w:rPr>
+    </w:lvl>
+    <w:lvl w:ilvl="1" w:tentative="1">
+      <w:start w:val="1"/>
+      <w:numFmt w:val="bullet"/>
+      <w:lvlText w:val="o"/>
+      <w:lvlJc w:val="left"/>
+      <w:pPr>
+        <w:tabs>
+          <w:tab w:val="num" w:pos="1440"/>
+        </w:tabs>
+        <w:ind w:left="1440" w:hanging="360"/>
+      </w:pPr>
+      <w:rPr>
+        <w:rFonts w:ascii="Courier New" w:hAnsi="Courier New" w:hint="default"/>
+        <w:sz w:val="20"/>
+      </w:rPr>
+    </w:lvl>
+    <w:lvl w:ilvl="2" w:tentative="1">
+      <w:start w:val="1"/>
+      <w:numFmt w:val="bullet"/>
+      <w:lvlText w:val=""/>
+      <w:lvlJc w:val="left"/>
+      <w:pPr>
+        <w:tabs>
+          <w:tab w:val="num" w:pos="2160"/>
+        </w:tabs>
+        <w:ind w:left="2160" w:hanging="360"/>
+      </w:pPr>
+      <w:rPr>
+        <w:rFonts w:ascii="Wingdings" w:hAnsi="Wingdings" w:hint="default"/>
+        <w:sz w:val="20"/>
+      </w:rPr>
+    </w:lvl>
+    <w:lvl w:ilvl="3" w:tentative="1">
+      <w:start w:val="1"/>
+      <w:numFmt w:val="bullet"/>
+      <w:lvlText w:val=""/>
+      <w:lvlJc w:val="left"/>
+      <w:pPr>
+        <w:tabs>
+          <w:tab w:val="num" w:pos="2880"/>
+        </w:tabs>
+        <w:ind w:left="2880" w:hanging="360"/>
+      </w:pPr>
+      <w:rPr>
+        <w:rFonts w:ascii="Wingdings" w:hAnsi="Wingdings" w:hint="default"/>
+        <w:sz w:val="20"/>
+      </w:rPr>
+    </w:lvl>
+    <w:lvl w:ilvl="4" w:tentative="1">
+      <w:start w:val="1"/>
+      <w:numFmt w:val="bullet"/>
+      <w:lvlText w:val=""/>
+      <w:lvlJc w:val="left"/>
+      <w:pPr>
+        <w:tabs>
+          <w:tab w:val="num" w:pos="3600"/>
+        </w:tabs>
+        <w:ind w:left="3600" w:hanging="360"/>
+      </w:pPr>
+      <w:rPr>
+        <w:rFonts w:ascii="Wingdings" w:hAnsi="Wingdings" w:hint="default"/>
+        <w:sz w:val="20"/>
+      </w:rPr>
+    </w:lvl>
+    <w:lvl w:ilvl="5" w:tentative="1">
+      <w:start w:val="1"/>
+      <w:numFmt w:val="bullet"/>
+      <w:lvlText w:val=""/>
+      <w:lvlJc w:val="left"/>
+      <w:pPr>
+        <w:tabs>
+          <w:tab w:val="num" w:pos="4320"/>
+        </w:tabs>
+        <w:ind w:left="4320" w:hanging="360"/>
+      </w:pPr>
+      <w:rPr>
+        <w:rFonts w:ascii="Wingdings" w:hAnsi="Wingdings" w:hint="default"/>
+        <w:sz w:val="20"/>
+      </w:rPr>
+    </w:lvl>
+    <w:lvl w:ilvl="6" w:tentative="1">
+      <w:start w:val="1"/>
+      <w:numFmt w:val="bullet"/>
+      <w:lvlText w:val=""/>
+      <w:lvlJc w:val="left"/>
+      <w:pPr>
+        <w:tabs>
+          <w:tab w:val="num" w:pos="5040"/>
+        </w:tabs>
+        <w:ind w:left="5040" w:hanging="360"/>
+      </w:pPr>
+      <w:rPr>
+        <w:rFonts w:ascii="Wingdings" w:hAnsi="Wingdings" w:hint="default"/>
+        <w:sz w:val="20"/>
+      </w:rPr>
+    </w:lvl>
+    <w:lvl w:ilvl="7" w:tentative="1">
+      <w:start w:val="1"/>
+      <w:numFmt w:val="bullet"/>
+      <w:lvlText w:val=""/>
+      <w:lvlJc w:val="left"/>
+      <w:pPr>
+        <w:tabs>
+          <w:tab w:val="num" w:pos="5760"/>
+        </w:tabs>
+        <w:ind w:left="5760" w:hanging="360"/>
+      </w:pPr>
+      <w:rPr>
+        <w:rFonts w:ascii="Wingdings" w:hAnsi="Wingdings" w:hint="default"/>
+        <w:sz w:val="20"/>
+      </w:rPr>
+    </w:lvl>
+    <w:lvl w:ilvl="8" w:tentative="1">
+      <w:start w:val="1"/>
+      <w:numFmt w:val="bullet"/>
+      <w:lvlText w:val=""/>
+      <w:lvlJc w:val="left"/>
+      <w:pPr>
+        <w:tabs>
+          <w:tab w:val="num" w:pos="6480"/>
+        </w:tabs>
+        <w:ind w:left="6480" w:hanging="360"/>
+      </w:pPr>
+      <w:rPr>
+        <w:rFonts w:ascii="Wingdings" w:hAnsi="Wingdings" w:hint="default"/>
+        <w:sz w:val="20"/>
+      </w:rPr>
+    </w:lvl>
+  </w:abstractNum>
+  <w:abstractNum w:abstractNumId="1" w15:restartNumberingAfterBreak="0">
+    <w:nsid w:val="2A4B451E"/>
+    <w:multiLevelType w:val="multilevel"/>
+    <w:tmpl w:val="B302FF66"/>
+    <w:lvl w:ilvl="0">
+      <w:start w:val="1"/>
+      <w:numFmt w:val="bullet"/>
+      <w:lvlText w:val=""/>
+      <w:lvlJc w:val="left"/>
+      <w:pPr>
+        <w:tabs>
+          <w:tab w:val="num" w:pos="720"/>
+        </w:tabs>
+        <w:ind w:left="720" w:hanging="360"/>
+      </w:pPr>
+      <w:rPr>
+        <w:rFonts w:ascii="Symbol" w:hAnsi="Symbol" w:hint="default"/>
+        <w:sz w:val="20"/>
+      </w:rPr>
+    </w:lvl>
+    <w:lvl w:ilvl="1" w:tentative="1">
+      <w:start w:val="1"/>
+      <w:numFmt w:val="bullet"/>
+      <w:lvlText w:val="o"/>
+      <w:lvlJc w:val="left"/>
+      <w:pPr>
+        <w:tabs>
+          <w:tab w:val="num" w:pos="1440"/>
+        </w:tabs>
+        <w:ind w:left="1440" w:hanging="360"/>
+      </w:pPr>
+      <w:rPr>
+        <w:rFonts w:ascii="Courier New" w:hAnsi="Courier New" w:hint="default"/>
+        <w:sz w:val="20"/>
+      </w:rPr>
+    </w:lvl>
+    <w:lvl w:ilvl="2" w:tentative="1">
+      <w:start w:val="1"/>
+      <w:numFmt w:val="bullet"/>
+      <w:lvlText w:val=""/>
+      <w:lvlJc w:val="left"/>
+      <w:pPr>
+        <w:tabs>
+          <w:tab w:val="num" w:pos="2160"/>
+        </w:tabs>
+        <w:ind w:left="2160" w:hanging="360"/>
+      </w:pPr>
+      <w:rPr>
+        <w:rFonts w:ascii="Wingdings" w:hAnsi="Wingdings" w:hint="default"/>
+        <w:sz w:val="20"/>
+      </w:rPr>
+    </w:lvl>
+    <w:lvl w:ilvl="3" w:tentative="1">
+      <w:start w:val="1"/>
+      <w:numFmt w:val="bullet"/>
+      <w:lvlText w:val=""/>
+      <w:lvlJc w:val="left"/>
+      <w:pPr>
+        <w:tabs>
+          <w:tab w:val="num" w:pos="2880"/>
+        </w:tabs>
+        <w:ind w:left="2880" w:hanging="360"/>
+      </w:pPr>
+      <w:rPr>
+        <w:rFonts w:ascii="Wingdings" w:hAnsi="Wingdings" w:hint="default"/>
+        <w:sz w:val="20"/>
+      </w:rPr>
+    </w:lvl>
+    <w:lvl w:ilvl="4" w:tentative="1">
+      <w:start w:val="1"/>
+      <w:numFmt w:val="bullet"/>
+      <w:lvlText w:val=""/>
+      <w:lvlJc w:val="left"/>
+      <w:pPr>
+        <w:tabs>
+          <w:tab w:val="num" w:pos="3600"/>
+        </w:tabs>
+        <w:ind w:left="3600" w:hanging="360"/>
+      </w:pPr>
+      <w:rPr>
+        <w:rFonts w:ascii="Wingdings" w:hAnsi="Wingdings" w:hint="default"/>
+        <w:sz w:val="20"/>
+      </w:rPr>
+    </w:lvl>
+    <w:lvl w:ilvl="5" w:tentative="1">
+      <w:start w:val="1"/>
+      <w:numFmt w:val="bullet"/>
+      <w:lvlText w:val=""/>
+      <w:lvlJc w:val="left"/>
+      <w:pPr>
+        <w:tabs>
+          <w:tab w:val="num" w:pos="4320"/>
+        </w:tabs>
+        <w:ind w:left="4320" w:hanging="360"/>
+      </w:pPr>
+      <w:rPr>
+        <w:rFonts w:ascii="Wingdings" w:hAnsi="Wingdings" w:hint="default"/>
+        <w:sz w:val="20"/>
+      </w:rPr>
+    </w:lvl>
+    <w:lvl w:ilvl="6" w:tentative="1">
+      <w:start w:val="1"/>
+      <w:numFmt w:val="bullet"/>
+      <w:lvlText w:val=""/>
+      <w:lvlJc w:val="left"/>
+      <w:pPr>
+        <w:tabs>
+          <w:tab w:val="num" w:pos="5040"/>
+        </w:tabs>
+        <w:ind w:left="5040" w:hanging="360"/>
+      </w:pPr>
+      <w:rPr>
+        <w:rFonts w:ascii="Wingdings" w:hAnsi="Wingdings" w:hint="default"/>
+        <w:sz w:val="20"/>
+      </w:rPr>
+    </w:lvl>
+    <w:lvl w:ilvl="7" w:tentative="1">
+      <w:start w:val="1"/>
+      <w:numFmt w:val="bullet"/>
+      <w:lvlText w:val=""/>
+      <w:lvlJc w:val="left"/>
+      <w:pPr>
+        <w:tabs>
+          <w:tab w:val="num" w:pos="5760"/>
+        </w:tabs>
+        <w:ind w:left="5760" w:hanging="360"/>
+      </w:pPr>
+      <w:rPr>
+        <w:rFonts w:ascii="Wingdings" w:hAnsi="Wingdings" w:hint="default"/>
+        <w:sz w:val="20"/>
+      </w:rPr>
+    </w:lvl>
+    <w:lvl w:ilvl="8" w:tentative="1">
+      <w:start w:val="1"/>
+      <w:numFmt w:val="bullet"/>
+      <w:lvlText w:val=""/>
+      <w:lvlJc w:val="left"/>
+      <w:pPr>
+        <w:tabs>
+          <w:tab w:val="num" w:pos="6480"/>
+        </w:tabs>
+        <w:ind w:left="6480" w:hanging="360"/>
+      </w:pPr>
+      <w:rPr>
+        <w:rFonts w:ascii="Wingdings" w:hAnsi="Wingdings" w:hint="default"/>
+        <w:sz w:val="20"/>
+      </w:rPr>
+    </w:lvl>
+  </w:abstractNum>
+  <w:abstractNum w:abstractNumId="2" w15:restartNumberingAfterBreak="0">
+    <w:nsid w:val="2A9435C3"/>
+    <w:multiLevelType w:val="multilevel"/>
+    <w:tmpl w:val="6DFCE7E0"/>
+    <w:lvl w:ilvl="0">
+      <w:start w:val="1"/>
+      <w:numFmt w:val="bullet"/>
+      <w:lvlText w:val=""/>
+      <w:lvlJc w:val="left"/>
+      <w:pPr>
+        <w:tabs>
+          <w:tab w:val="num" w:pos="720"/>
+        </w:tabs>
+        <w:ind w:left="720" w:hanging="360"/>
+      </w:pPr>
+      <w:rPr>
+        <w:rFonts w:ascii="Symbol" w:hAnsi="Symbol" w:hint="default"/>
+        <w:sz w:val="20"/>
+      </w:rPr>
+    </w:lvl>
+    <w:lvl w:ilvl="1" w:tentative="1">
+      <w:start w:val="1"/>
+      <w:numFmt w:val="bullet"/>
+      <w:lvlText w:val="o"/>
+      <w:lvlJc w:val="left"/>
+      <w:pPr>
+        <w:tabs>
+          <w:tab w:val="num" w:pos="1440"/>
+        </w:tabs>
+        <w:ind w:left="1440" w:hanging="360"/>
+      </w:pPr>
+      <w:rPr>
+        <w:rFonts w:ascii="Courier New" w:hAnsi="Courier New" w:hint="default"/>
+        <w:sz w:val="20"/>
+      </w:rPr>
+    </w:lvl>
+    <w:lvl w:ilvl="2" w:tentative="1">
+      <w:start w:val="1"/>
+      <w:numFmt w:val="bullet"/>
+      <w:lvlText w:val=""/>
+      <w:lvlJc w:val="left"/>
+      <w:pPr>
+        <w:tabs>
+          <w:tab w:val="num" w:pos="2160"/>
+        </w:tabs>
+        <w:ind w:left="2160" w:hanging="360"/>
+      </w:pPr>
+      <w:rPr>
+        <w:rFonts w:ascii="Wingdings" w:hAnsi="Wingdings" w:hint="default"/>
+        <w:sz w:val="20"/>
+      </w:rPr>
+    </w:lvl>
+    <w:lvl w:ilvl="3" w:tentative="1">
+      <w:start w:val="1"/>
+      <w:numFmt w:val="bullet"/>
+      <w:lvlText w:val=""/>
+      <w:lvlJc w:val="left"/>
+      <w:pPr>
+        <w:tabs>
+          <w:tab w:val="num" w:pos="2880"/>
+        </w:tabs>
+        <w:ind w:left="2880" w:hanging="360"/>
+      </w:pPr>
+      <w:rPr>
+        <w:rFonts w:ascii="Wingdings" w:hAnsi="Wingdings" w:hint="default"/>
+        <w:sz w:val="20"/>
+      </w:rPr>
+    </w:lvl>
+    <w:lvl w:ilvl="4" w:tentative="1">
+      <w:start w:val="1"/>
+      <w:numFmt w:val="bullet"/>
+      <w:lvlText w:val=""/>
+      <w:lvlJc w:val="left"/>
+      <w:pPr>
+        <w:tabs>
+          <w:tab w:val="num" w:pos="3600"/>
+        </w:tabs>
+        <w:ind w:left="3600" w:hanging="360"/>
+      </w:pPr>
+      <w:rPr>
+        <w:rFonts w:ascii="Wingdings" w:hAnsi="Wingdings" w:hint="default"/>
+        <w:sz w:val="20"/>
+      </w:rPr>
+    </w:lvl>
+    <w:lvl w:ilvl="5" w:tentative="1">
+      <w:start w:val="1"/>
+      <w:numFmt w:val="bullet"/>
+      <w:lvlText w:val=""/>
+      <w:lvlJc w:val="left"/>
+      <w:pPr>
+        <w:tabs>
+          <w:tab w:val="num" w:pos="4320"/>
+        </w:tabs>
+        <w:ind w:left="4320" w:hanging="360"/>
+      </w:pPr>
+      <w:rPr>
+        <w:rFonts w:ascii="Wingdings" w:hAnsi="Wingdings" w:hint="default"/>
+        <w:sz w:val="20"/>
+      </w:rPr>
+    </w:lvl>
+    <w:lvl w:ilvl="6" w:tentative="1">
+      <w:start w:val="1"/>
+      <w:numFmt w:val="bullet"/>
+      <w:lvlText w:val=""/>
+      <w:lvlJc w:val="left"/>
+      <w:pPr>
+        <w:tabs>
+          <w:tab w:val="num" w:pos="5040"/>
+        </w:tabs>
+        <w:ind w:left="5040" w:hanging="360"/>
+      </w:pPr>
+      <w:rPr>
+        <w:rFonts w:ascii="Wingdings" w:hAnsi="Wingdings" w:hint="default"/>
+        <w:sz w:val="20"/>
+      </w:rPr>
+    </w:lvl>
+    <w:lvl w:ilvl="7" w:tentative="1">
+      <w:start w:val="1"/>
+      <w:numFmt w:val="bullet"/>
+      <w:lvlText w:val=""/>
+      <w:lvlJc w:val="left"/>
+      <w:pPr>
+        <w:tabs>
+          <w:tab w:val="num" w:pos="5760"/>
+        </w:tabs>
+        <w:ind w:left="5760" w:hanging="360"/>
+      </w:pPr>
+      <w:rPr>
+        <w:rFonts w:ascii="Wingdings" w:hAnsi="Wingdings" w:hint="default"/>
+        <w:sz w:val="20"/>
+      </w:rPr>
+    </w:lvl>
+    <w:lvl w:ilvl="8" w:tentative="1">
+      <w:start w:val="1"/>
+      <w:numFmt w:val="bullet"/>
+      <w:lvlText w:val=""/>
+      <w:lvlJc w:val="left"/>
+      <w:pPr>
+        <w:tabs>
+          <w:tab w:val="num" w:pos="6480"/>
+        </w:tabs>
+        <w:ind w:left="6480" w:hanging="360"/>
+      </w:pPr>
+      <w:rPr>
+        <w:rFonts w:ascii="Wingdings" w:hAnsi="Wingdings" w:hint="default"/>
+        <w:sz w:val="20"/>
+      </w:rPr>
+    </w:lvl>
+  </w:abstractNum>
+  <w:abstractNum w:abstractNumId="3" w15:restartNumberingAfterBreak="0">
     <w:nsid w:val="3A5458EA"/>
     <w:multiLevelType w:val="multilevel"/>
     <w:tmpl w:val="A61CFDEC"/>
@@ -1388,7 +2451,156 @@
       </w:rPr>
     </w:lvl>
   </w:abstractNum>
-  <w:abstractNum w:abstractNumId="1" w15:restartNumberingAfterBreak="0">
+  <w:abstractNum w:abstractNumId="4" w15:restartNumberingAfterBreak="0">
+    <w:nsid w:val="4E803CC8"/>
+    <w:multiLevelType w:val="multilevel"/>
+    <w:tmpl w:val="FCDAD574"/>
+    <w:lvl w:ilvl="0">
+      <w:start w:val="1"/>
+      <w:numFmt w:val="bullet"/>
+      <w:lvlText w:val=""/>
+      <w:lvlJc w:val="left"/>
+      <w:pPr>
+        <w:tabs>
+          <w:tab w:val="num" w:pos="720"/>
+        </w:tabs>
+        <w:ind w:left="720" w:hanging="360"/>
+      </w:pPr>
+      <w:rPr>
+        <w:rFonts w:ascii="Symbol" w:hAnsi="Symbol" w:hint="default"/>
+        <w:sz w:val="20"/>
+      </w:rPr>
+    </w:lvl>
+    <w:lvl w:ilvl="1" w:tentative="1">
+      <w:start w:val="1"/>
+      <w:numFmt w:val="bullet"/>
+      <w:lvlText w:val="o"/>
+      <w:lvlJc w:val="left"/>
+      <w:pPr>
+        <w:tabs>
+          <w:tab w:val="num" w:pos="1440"/>
+        </w:tabs>
+        <w:ind w:left="1440" w:hanging="360"/>
+      </w:pPr>
+      <w:rPr>
+        <w:rFonts w:ascii="Courier New" w:hAnsi="Courier New" w:hint="default"/>
+        <w:sz w:val="20"/>
+      </w:rPr>
+    </w:lvl>
+    <w:lvl w:ilvl="2" w:tentative="1">
+      <w:start w:val="1"/>
+      <w:numFmt w:val="bullet"/>
+      <w:lvlText w:val=""/>
+      <w:lvlJc w:val="left"/>
+      <w:pPr>
+        <w:tabs>
+          <w:tab w:val="num" w:pos="2160"/>
+        </w:tabs>
+        <w:ind w:left="2160" w:hanging="360"/>
+      </w:pPr>
+      <w:rPr>
+        <w:rFonts w:ascii="Wingdings" w:hAnsi="Wingdings" w:hint="default"/>
+        <w:sz w:val="20"/>
+      </w:rPr>
+    </w:lvl>
+    <w:lvl w:ilvl="3" w:tentative="1">
+      <w:start w:val="1"/>
+      <w:numFmt w:val="bullet"/>
+      <w:lvlText w:val=""/>
+      <w:lvlJc w:val="left"/>
+      <w:pPr>
+        <w:tabs>
+          <w:tab w:val="num" w:pos="2880"/>
+        </w:tabs>
+        <w:ind w:left="2880" w:hanging="360"/>
+      </w:pPr>
+      <w:rPr>
+        <w:rFonts w:ascii="Wingdings" w:hAnsi="Wingdings" w:hint="default"/>
+        <w:sz w:val="20"/>
+      </w:rPr>
+    </w:lvl>
+    <w:lvl w:ilvl="4" w:tentative="1">
+      <w:start w:val="1"/>
+      <w:numFmt w:val="bullet"/>
+      <w:lvlText w:val=""/>
+      <w:lvlJc w:val="left"/>
+      <w:pPr>
+        <w:tabs>
+          <w:tab w:val="num" w:pos="3600"/>
+        </w:tabs>
+        <w:ind w:left="3600" w:hanging="360"/>
+      </w:pPr>
+      <w:rPr>
+        <w:rFonts w:ascii="Wingdings" w:hAnsi="Wingdings" w:hint="default"/>
+        <w:sz w:val="20"/>
+      </w:rPr>
+    </w:lvl>
+    <w:lvl w:ilvl="5" w:tentative="1">
+      <w:start w:val="1"/>
+      <w:numFmt w:val="bullet"/>
+      <w:lvlText w:val=""/>
+      <w:lvlJc w:val="left"/>
+      <w:pPr>
+        <w:tabs>
+          <w:tab w:val="num" w:pos="4320"/>
+        </w:tabs>
+        <w:ind w:left="4320" w:hanging="360"/>
+      </w:pPr>
+      <w:rPr>
+        <w:rFonts w:ascii="Wingdings" w:hAnsi="Wingdings" w:hint="default"/>
+        <w:sz w:val="20"/>
+      </w:rPr>
+    </w:lvl>
+    <w:lvl w:ilvl="6" w:tentative="1">
+      <w:start w:val="1"/>
+      <w:numFmt w:val="bullet"/>
+      <w:lvlText w:val=""/>
+      <w:lvlJc w:val="left"/>
+      <w:pPr>
+        <w:tabs>
+          <w:tab w:val="num" w:pos="5040"/>
+        </w:tabs>
+        <w:ind w:left="5040" w:hanging="360"/>
+      </w:pPr>
+      <w:rPr>
+        <w:rFonts w:ascii="Wingdings" w:hAnsi="Wingdings" w:hint="default"/>
+        <w:sz w:val="20"/>
+      </w:rPr>
+    </w:lvl>
+    <w:lvl w:ilvl="7" w:tentative="1">
+      <w:start w:val="1"/>
+      <w:numFmt w:val="bullet"/>
+      <w:lvlText w:val=""/>
+      <w:lvlJc w:val="left"/>
+      <w:pPr>
+        <w:tabs>
+          <w:tab w:val="num" w:pos="5760"/>
+        </w:tabs>
+        <w:ind w:left="5760" w:hanging="360"/>
+      </w:pPr>
+      <w:rPr>
+        <w:rFonts w:ascii="Wingdings" w:hAnsi="Wingdings" w:hint="default"/>
+        <w:sz w:val="20"/>
+      </w:rPr>
+    </w:lvl>
+    <w:lvl w:ilvl="8" w:tentative="1">
+      <w:start w:val="1"/>
+      <w:numFmt w:val="bullet"/>
+      <w:lvlText w:val=""/>
+      <w:lvlJc w:val="left"/>
+      <w:pPr>
+        <w:tabs>
+          <w:tab w:val="num" w:pos="6480"/>
+        </w:tabs>
+        <w:ind w:left="6480" w:hanging="360"/>
+      </w:pPr>
+      <w:rPr>
+        <w:rFonts w:ascii="Wingdings" w:hAnsi="Wingdings" w:hint="default"/>
+        <w:sz w:val="20"/>
+      </w:rPr>
+    </w:lvl>
+  </w:abstractNum>
+  <w:abstractNum w:abstractNumId="5" w15:restartNumberingAfterBreak="0">
     <w:nsid w:val="4EBA0CA9"/>
     <w:multiLevelType w:val="multilevel"/>
     <w:tmpl w:val="D95659C0"/>
@@ -1537,7 +2749,7 @@
       </w:rPr>
     </w:lvl>
   </w:abstractNum>
-  <w:abstractNum w:abstractNumId="2" w15:restartNumberingAfterBreak="0">
+  <w:abstractNum w:abstractNumId="6" w15:restartNumberingAfterBreak="0">
     <w:nsid w:val="550735C0"/>
     <w:multiLevelType w:val="multilevel"/>
     <w:tmpl w:val="A334B14C"/>
@@ -1686,7 +2898,7 @@
       </w:rPr>
     </w:lvl>
   </w:abstractNum>
-  <w:abstractNum w:abstractNumId="3" w15:restartNumberingAfterBreak="0">
+  <w:abstractNum w:abstractNumId="7" w15:restartNumberingAfterBreak="0">
     <w:nsid w:val="602230C7"/>
     <w:multiLevelType w:val="multilevel"/>
     <w:tmpl w:val="EFF89B92"/>
@@ -1835,7 +3047,7 @@
       </w:rPr>
     </w:lvl>
   </w:abstractNum>
-  <w:abstractNum w:abstractNumId="4" w15:restartNumberingAfterBreak="0">
+  <w:abstractNum w:abstractNumId="8" w15:restartNumberingAfterBreak="0">
     <w:nsid w:val="72277FBE"/>
     <w:multiLevelType w:val="multilevel"/>
     <w:tmpl w:val="F50EB84A"/>
@@ -1984,7 +3196,7 @@
       </w:rPr>
     </w:lvl>
   </w:abstractNum>
-  <w:abstractNum w:abstractNumId="5" w15:restartNumberingAfterBreak="0">
+  <w:abstractNum w:abstractNumId="9" w15:restartNumberingAfterBreak="0">
     <w:nsid w:val="731A7F7B"/>
     <w:multiLevelType w:val="multilevel"/>
     <w:tmpl w:val="CC56A3BA"/>
@@ -2133,7 +3345,7 @@
       </w:rPr>
     </w:lvl>
   </w:abstractNum>
-  <w:abstractNum w:abstractNumId="6" w15:restartNumberingAfterBreak="0">
+  <w:abstractNum w:abstractNumId="10" w15:restartNumberingAfterBreak="0">
     <w:nsid w:val="75BB47BF"/>
     <w:multiLevelType w:val="multilevel"/>
     <w:tmpl w:val="53B26BD2"/>
@@ -2282,26 +3494,190 @@
       </w:rPr>
     </w:lvl>
   </w:abstractNum>
+  <w:abstractNum w:abstractNumId="11" w15:restartNumberingAfterBreak="0">
+    <w:nsid w:val="75C600AF"/>
+    <w:multiLevelType w:val="multilevel"/>
+    <w:tmpl w:val="AAF2B126"/>
+    <w:lvl w:ilvl="0">
+      <w:start w:val="1"/>
+      <w:numFmt w:val="bullet"/>
+      <w:lvlText w:val=""/>
+      <w:lvlJc w:val="left"/>
+      <w:pPr>
+        <w:tabs>
+          <w:tab w:val="num" w:pos="720"/>
+        </w:tabs>
+        <w:ind w:left="720" w:hanging="360"/>
+      </w:pPr>
+      <w:rPr>
+        <w:rFonts w:ascii="Symbol" w:hAnsi="Symbol" w:hint="default"/>
+        <w:sz w:val="20"/>
+      </w:rPr>
+    </w:lvl>
+    <w:lvl w:ilvl="1" w:tentative="1">
+      <w:start w:val="1"/>
+      <w:numFmt w:val="bullet"/>
+      <w:lvlText w:val="o"/>
+      <w:lvlJc w:val="left"/>
+      <w:pPr>
+        <w:tabs>
+          <w:tab w:val="num" w:pos="1440"/>
+        </w:tabs>
+        <w:ind w:left="1440" w:hanging="360"/>
+      </w:pPr>
+      <w:rPr>
+        <w:rFonts w:ascii="Courier New" w:hAnsi="Courier New" w:hint="default"/>
+        <w:sz w:val="20"/>
+      </w:rPr>
+    </w:lvl>
+    <w:lvl w:ilvl="2" w:tentative="1">
+      <w:start w:val="1"/>
+      <w:numFmt w:val="bullet"/>
+      <w:lvlText w:val=""/>
+      <w:lvlJc w:val="left"/>
+      <w:pPr>
+        <w:tabs>
+          <w:tab w:val="num" w:pos="2160"/>
+        </w:tabs>
+        <w:ind w:left="2160" w:hanging="360"/>
+      </w:pPr>
+      <w:rPr>
+        <w:rFonts w:ascii="Wingdings" w:hAnsi="Wingdings" w:hint="default"/>
+        <w:sz w:val="20"/>
+      </w:rPr>
+    </w:lvl>
+    <w:lvl w:ilvl="3" w:tentative="1">
+      <w:start w:val="1"/>
+      <w:numFmt w:val="bullet"/>
+      <w:lvlText w:val=""/>
+      <w:lvlJc w:val="left"/>
+      <w:pPr>
+        <w:tabs>
+          <w:tab w:val="num" w:pos="2880"/>
+        </w:tabs>
+        <w:ind w:left="2880" w:hanging="360"/>
+      </w:pPr>
+      <w:rPr>
+        <w:rFonts w:ascii="Wingdings" w:hAnsi="Wingdings" w:hint="default"/>
+        <w:sz w:val="20"/>
+      </w:rPr>
+    </w:lvl>
+    <w:lvl w:ilvl="4" w:tentative="1">
+      <w:start w:val="1"/>
+      <w:numFmt w:val="bullet"/>
+      <w:lvlText w:val=""/>
+      <w:lvlJc w:val="left"/>
+      <w:pPr>
+        <w:tabs>
+          <w:tab w:val="num" w:pos="3600"/>
+        </w:tabs>
+        <w:ind w:left="3600" w:hanging="360"/>
+      </w:pPr>
+      <w:rPr>
+        <w:rFonts w:ascii="Wingdings" w:hAnsi="Wingdings" w:hint="default"/>
+        <w:sz w:val="20"/>
+      </w:rPr>
+    </w:lvl>
+    <w:lvl w:ilvl="5" w:tentative="1">
+      <w:start w:val="1"/>
+      <w:numFmt w:val="bullet"/>
+      <w:lvlText w:val=""/>
+      <w:lvlJc w:val="left"/>
+      <w:pPr>
+        <w:tabs>
+          <w:tab w:val="num" w:pos="4320"/>
+        </w:tabs>
+        <w:ind w:left="4320" w:hanging="360"/>
+      </w:pPr>
+      <w:rPr>
+        <w:rFonts w:ascii="Wingdings" w:hAnsi="Wingdings" w:hint="default"/>
+        <w:sz w:val="20"/>
+      </w:rPr>
+    </w:lvl>
+    <w:lvl w:ilvl="6" w:tentative="1">
+      <w:start w:val="1"/>
+      <w:numFmt w:val="bullet"/>
+      <w:lvlText w:val=""/>
+      <w:lvlJc w:val="left"/>
+      <w:pPr>
+        <w:tabs>
+          <w:tab w:val="num" w:pos="5040"/>
+        </w:tabs>
+        <w:ind w:left="5040" w:hanging="360"/>
+      </w:pPr>
+      <w:rPr>
+        <w:rFonts w:ascii="Wingdings" w:hAnsi="Wingdings" w:hint="default"/>
+        <w:sz w:val="20"/>
+      </w:rPr>
+    </w:lvl>
+    <w:lvl w:ilvl="7" w:tentative="1">
+      <w:start w:val="1"/>
+      <w:numFmt w:val="bullet"/>
+      <w:lvlText w:val=""/>
+      <w:lvlJc w:val="left"/>
+      <w:pPr>
+        <w:tabs>
+          <w:tab w:val="num" w:pos="5760"/>
+        </w:tabs>
+        <w:ind w:left="5760" w:hanging="360"/>
+      </w:pPr>
+      <w:rPr>
+        <w:rFonts w:ascii="Wingdings" w:hAnsi="Wingdings" w:hint="default"/>
+        <w:sz w:val="20"/>
+      </w:rPr>
+    </w:lvl>
+    <w:lvl w:ilvl="8" w:tentative="1">
+      <w:start w:val="1"/>
+      <w:numFmt w:val="bullet"/>
+      <w:lvlText w:val=""/>
+      <w:lvlJc w:val="left"/>
+      <w:pPr>
+        <w:tabs>
+          <w:tab w:val="num" w:pos="6480"/>
+        </w:tabs>
+        <w:ind w:left="6480" w:hanging="360"/>
+      </w:pPr>
+      <w:rPr>
+        <w:rFonts w:ascii="Wingdings" w:hAnsi="Wingdings" w:hint="default"/>
+        <w:sz w:val="20"/>
+      </w:rPr>
+    </w:lvl>
+  </w:abstractNum>
   <w:num w:numId="1" w16cid:durableId="1807157444">
+    <w:abstractNumId w:val="7"/>
+  </w:num>
+  <w:num w:numId="2" w16cid:durableId="814878092">
+    <w:abstractNumId w:val="8"/>
+  </w:num>
+  <w:num w:numId="3" w16cid:durableId="1493175462">
+    <w:abstractNumId w:val="9"/>
+  </w:num>
+  <w:num w:numId="4" w16cid:durableId="2089963244">
+    <w:abstractNumId w:val="10"/>
+  </w:num>
+  <w:num w:numId="5" w16cid:durableId="1804228442">
     <w:abstractNumId w:val="3"/>
   </w:num>
-  <w:num w:numId="2" w16cid:durableId="814878092">
+  <w:num w:numId="6" w16cid:durableId="836381710">
+    <w:abstractNumId w:val="6"/>
+  </w:num>
+  <w:num w:numId="7" w16cid:durableId="1161966786">
+    <w:abstractNumId w:val="5"/>
+  </w:num>
+  <w:num w:numId="8" w16cid:durableId="319191962">
+    <w:abstractNumId w:val="2"/>
+  </w:num>
+  <w:num w:numId="9" w16cid:durableId="1124471293">
+    <w:abstractNumId w:val="0"/>
+  </w:num>
+  <w:num w:numId="10" w16cid:durableId="855578222">
     <w:abstractNumId w:val="4"/>
   </w:num>
-  <w:num w:numId="3" w16cid:durableId="1493175462">
-    <w:abstractNumId w:val="5"/>
+  <w:num w:numId="11" w16cid:durableId="965938592">
+    <w:abstractNumId w:val="1"/>
   </w:num>
-  <w:num w:numId="4" w16cid:durableId="2089963244">
-    <w:abstractNumId w:val="6"/>
-  </w:num>
-  <w:num w:numId="5" w16cid:durableId="1804228442">
-    <w:abstractNumId w:val="0"/>
-  </w:num>
-  <w:num w:numId="6" w16cid:durableId="836381710">
-    <w:abstractNumId w:val="2"/>
-  </w:num>
-  <w:num w:numId="7" w16cid:durableId="1161966786">
-    <w:abstractNumId w:val="1"/>
+  <w:num w:numId="12" w16cid:durableId="1368483677">
+    <w:abstractNumId w:val="11"/>
   </w:num>
 </w:numbering>
 </file>

</xml_diff>

<commit_message>
fix(pipeline): resolve NameError in orchestrator and adjust rate limits
- Add missing time module import in main.py to prevent workflow crash after the first iteration.

- Increase API cooldown from 10s to 40s in main.py to fully comply with Gemini API rate limits and avoid 429 errors.

- Implement empty DataFrame validation in load.py to prevent IndexError during data ingestion on market holidays.
</commit_message>
<xml_diff>
--- a/progress/Diario de Trabajo.docx
+++ b/progress/Diario de Trabajo.docx
@@ -87,13 +87,18 @@
         <w:t>Configuración de Entorno Seguro:</w:t>
       </w:r>
       <w:r>
-        <w:t xml:space="preserve"> Creamos un entorno protegido mediante el archivo .</w:t>
+        <w:t xml:space="preserve"> Creamos un entorno protegido mediante el </w:t>
+      </w:r>
+      <w:proofErr w:type="gramStart"/>
+      <w:r>
+        <w:t>archivo .</w:t>
       </w:r>
       <w:proofErr w:type="spellStart"/>
       <w:r>
         <w:t>env</w:t>
       </w:r>
       <w:proofErr w:type="spellEnd"/>
+      <w:proofErr w:type="gramEnd"/>
       <w:r>
         <w:t xml:space="preserve"> y la librería </w:t>
       </w:r>
@@ -237,7 +242,15 @@
       </w:r>
       <w:proofErr w:type="spellEnd"/>
       <w:r>
-        <w:t xml:space="preserve"> show) para registrarla correctamente en el requirements.txt.</w:t>
+        <w:t xml:space="preserve"> </w:t>
+      </w:r>
+      <w:proofErr w:type="gramStart"/>
+      <w:r>
+        <w:t>show</w:t>
+      </w:r>
+      <w:proofErr w:type="gramEnd"/>
+      <w:r>
+        <w:t>) para registrarla correctamente en el requirements.txt.</w:t>
       </w:r>
     </w:p>
     <w:p>
@@ -263,7 +276,15 @@
       </w:r>
       <w:proofErr w:type="spellEnd"/>
       <w:r>
-        <w:t xml:space="preserve"> y comentarios en inglés a todo el script, subiendo el nivel del código a un estándar profesional para tu portfolio.</w:t>
+        <w:t xml:space="preserve"> y comentarios en inglés a todo el script, subiendo el nivel del código a un estándar profesional para tu </w:t>
+      </w:r>
+      <w:proofErr w:type="gramStart"/>
+      <w:r>
+        <w:t>portfolio</w:t>
+      </w:r>
+      <w:proofErr w:type="gramEnd"/>
+      <w:r>
+        <w:t>.</w:t>
       </w:r>
     </w:p>
     <w:p>
@@ -367,15 +388,31 @@
         <w:t xml:space="preserve"> de Índices:</w:t>
       </w:r>
       <w:r>
-        <w:t xml:space="preserve"> Descubrimos por qué y cómo usar .</w:t>
-      </w:r>
-      <w:proofErr w:type="spellStart"/>
-      <w:r>
-        <w:t>reset_index</w:t>
-      </w:r>
-      <w:proofErr w:type="spellEnd"/>
-      <w:r>
-        <w:t>() para convertir fechas ocultas en los márgenes de la tabla a columnas estándar, preparando el terreno para los cruces de la Fase 2.</w:t>
+        <w:t xml:space="preserve"> Descubrimos por qué y cómo </w:t>
+      </w:r>
+      <w:proofErr w:type="gramStart"/>
+      <w:r>
+        <w:t>usar .</w:t>
+      </w:r>
+      <w:proofErr w:type="spellStart"/>
+      <w:r>
+        <w:t>reset</w:t>
+      </w:r>
+      <w:proofErr w:type="gramEnd"/>
+      <w:r>
+        <w:t>_</w:t>
+      </w:r>
+      <w:proofErr w:type="gramStart"/>
+      <w:r>
+        <w:t>index</w:t>
+      </w:r>
+      <w:proofErr w:type="spellEnd"/>
+      <w:r>
+        <w:t>(</w:t>
+      </w:r>
+      <w:proofErr w:type="gramEnd"/>
+      <w:r>
+        <w:t>) para convertir fechas ocultas en los márgenes de la tabla a columnas estándar, preparando el terreno para los cruces de la Fase 2.</w:t>
       </w:r>
     </w:p>
     <w:p>
@@ -489,13 +526,18 @@
         <w:t xml:space="preserve"> JSON:</w:t>
       </w:r>
       <w:r>
-        <w:t xml:space="preserve"> Usamos .</w:t>
+        <w:t xml:space="preserve"> </w:t>
+      </w:r>
+      <w:proofErr w:type="gramStart"/>
+      <w:r>
+        <w:t>Usamos .</w:t>
       </w:r>
       <w:proofErr w:type="spellStart"/>
       <w:r>
         <w:t>json</w:t>
       </w:r>
       <w:proofErr w:type="spellEnd"/>
+      <w:proofErr w:type="gramEnd"/>
       <w:r>
         <w:t>() para transformar la respuesta cruda de internet en un diccionario nativo de Python fácilmente manipulable.</w:t>
       </w:r>
@@ -785,7 +827,15 @@
         <w:t>3</w:t>
       </w:r>
       <w:r>
-        <w:t>.5-flash debido a su óptimo equilibrio entre latencia (velocidad) y coste, ideal para el procesamiento de volúmenes de datos financieros diarios.</w:t>
+        <w:t>.5-</w:t>
+      </w:r>
+      <w:proofErr w:type="gramStart"/>
+      <w:r>
+        <w:t>flash</w:t>
+      </w:r>
+      <w:proofErr w:type="gramEnd"/>
+      <w:r>
+        <w:t xml:space="preserve"> debido a su óptimo equilibrio entre latencia (velocidad) y coste, ideal para el procesamiento de volúmenes de datos financieros diarios.</w:t>
       </w:r>
     </w:p>
     <w:p>
@@ -984,12 +1034,21 @@
       <w:r>
         <w:t xml:space="preserve"> He aprendido que el mayor riesgo en el análisis financiero es el </w:t>
       </w:r>
+      <w:proofErr w:type="gramStart"/>
       <w:r>
         <w:rPr>
           <w:i/>
           <w:iCs/>
         </w:rPr>
-        <w:t>Look-</w:t>
+        <w:t>Look</w:t>
+      </w:r>
+      <w:proofErr w:type="gramEnd"/>
+      <w:r>
+        <w:rPr>
+          <w:i/>
+          <w:iCs/>
+        </w:rPr>
+        <w:t>-</w:t>
       </w:r>
       <w:proofErr w:type="spellStart"/>
       <w:r>
@@ -1243,14 +1302,7 @@
           <w:b/>
           <w:bCs/>
         </w:rPr>
-        <w:t xml:space="preserve"> – </w:t>
-      </w:r>
-      <w:r>
-        <w:rPr>
-          <w:b/>
-          <w:bCs/>
-        </w:rPr>
-        <w:t>19:46</w:t>
+        <w:t xml:space="preserve"> – 19:46</w:t>
       </w:r>
     </w:p>
     <w:p>
@@ -1485,7 +1537,15 @@
         <w:t>Reto:</w:t>
       </w:r>
       <w:r>
-        <w:t xml:space="preserve"> El pipeline chocaba contra el límite de velocidad (Rate </w:t>
+        <w:t xml:space="preserve"> El pipeline </w:t>
+      </w:r>
+      <w:proofErr w:type="gramStart"/>
+      <w:r>
+        <w:t>chocaba contra</w:t>
+      </w:r>
+      <w:proofErr w:type="gramEnd"/>
+      <w:r>
+        <w:t xml:space="preserve"> el límite de velocidad (Rate </w:t>
       </w:r>
       <w:proofErr w:type="spellStart"/>
       <w:r>
@@ -1688,6 +1748,7 @@
         <w:t xml:space="preserve"> Configuramos </w:t>
       </w:r>
       <w:proofErr w:type="spellStart"/>
+      <w:proofErr w:type="gramStart"/>
       <w:r>
         <w:t>el</w:t>
       </w:r>
@@ -1700,22 +1761,33 @@
         <w:t>gitignore</w:t>
       </w:r>
       <w:proofErr w:type="spellEnd"/>
-      <w:r>
-        <w:t xml:space="preserve"> para excluir archivos sensibles (.</w:t>
+      <w:proofErr w:type="gramEnd"/>
+      <w:r>
+        <w:t xml:space="preserve"> para excluir archivos sensibles </w:t>
+      </w:r>
+      <w:proofErr w:type="gramStart"/>
+      <w:r>
+        <w:t>(.</w:t>
       </w:r>
       <w:proofErr w:type="spellStart"/>
       <w:r>
         <w:t>env</w:t>
       </w:r>
       <w:proofErr w:type="spellEnd"/>
-      <w:r>
-        <w:t>, claves .</w:t>
+      <w:proofErr w:type="gramEnd"/>
+      <w:r>
+        <w:t xml:space="preserve">, </w:t>
+      </w:r>
+      <w:proofErr w:type="gramStart"/>
+      <w:r>
+        <w:t>claves .</w:t>
       </w:r>
       <w:proofErr w:type="spellStart"/>
       <w:r>
         <w:t>json</w:t>
       </w:r>
       <w:proofErr w:type="spellEnd"/>
+      <w:proofErr w:type="gramEnd"/>
       <w:r>
         <w:t>) y archivos temporales (</w:t>
       </w:r>
@@ -1834,8 +1906,605 @@
         <w:t>), garantizando que la historia de cambios sea clara y estructurada.</w:t>
       </w:r>
     </w:p>
+    <w:p>
+      <w:r>
+        <w:rPr>
+          <w:noProof/>
+        </w:rPr>
+        <mc:AlternateContent>
+          <mc:Choice Requires="wps">
+            <w:drawing>
+              <wp:anchor distT="0" distB="0" distL="114300" distR="114300" simplePos="0" relativeHeight="251661312" behindDoc="0" locked="0" layoutInCell="1" allowOverlap="1" wp14:anchorId="39DFF140" wp14:editId="21DE19D5">
+                <wp:simplePos x="0" y="0"/>
+                <wp:positionH relativeFrom="column">
+                  <wp:posOffset>5714</wp:posOffset>
+                </wp:positionH>
+                <wp:positionV relativeFrom="paragraph">
+                  <wp:posOffset>145415</wp:posOffset>
+                </wp:positionV>
+                <wp:extent cx="5553075" cy="19050"/>
+                <wp:effectExtent l="0" t="0" r="28575" b="19050"/>
+                <wp:wrapNone/>
+                <wp:docPr id="1012715723" name="Conector recto 3"/>
+                <wp:cNvGraphicFramePr/>
+                <a:graphic xmlns:a="http://schemas.openxmlformats.org/drawingml/2006/main">
+                  <a:graphicData uri="http://schemas.microsoft.com/office/word/2010/wordprocessingShape">
+                    <wps:wsp>
+                      <wps:cNvCnPr/>
+                      <wps:spPr>
+                        <a:xfrm flipV="1">
+                          <a:off x="0" y="0"/>
+                          <a:ext cx="5553075" cy="19050"/>
+                        </a:xfrm>
+                        <a:prstGeom prst="line">
+                          <a:avLst/>
+                        </a:prstGeom>
+                      </wps:spPr>
+                      <wps:style>
+                        <a:lnRef idx="2">
+                          <a:schemeClr val="accent1"/>
+                        </a:lnRef>
+                        <a:fillRef idx="0">
+                          <a:schemeClr val="accent1"/>
+                        </a:fillRef>
+                        <a:effectRef idx="1">
+                          <a:schemeClr val="accent1"/>
+                        </a:effectRef>
+                        <a:fontRef idx="minor">
+                          <a:schemeClr val="tx1"/>
+                        </a:fontRef>
+                      </wps:style>
+                      <wps:bodyPr/>
+                    </wps:wsp>
+                  </a:graphicData>
+                </a:graphic>
+              </wp:anchor>
+            </w:drawing>
+          </mc:Choice>
+          <mc:Fallback>
+            <w:pict>
+              <v:line w14:anchorId="7BCC61F2" id="Conector recto 3" o:spid="_x0000_s1026" style="position:absolute;flip:y;z-index:251661312;visibility:visible;mso-wrap-style:square;mso-wrap-distance-left:9pt;mso-wrap-distance-top:0;mso-wrap-distance-right:9pt;mso-wrap-distance-bottom:0;mso-position-horizontal:absolute;mso-position-horizontal-relative:text;mso-position-vertical:absolute;mso-position-vertical-relative:text" from=".45pt,11.45pt" to="437.7pt,12.95pt" o:gfxdata="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" strokecolor="#156082 [3204]" strokeweight="1.5pt">
+                <v:stroke joinstyle="miter"/>
+              </v:line>
+            </w:pict>
+          </mc:Fallback>
+        </mc:AlternateContent>
+      </w:r>
+    </w:p>
     <w:p/>
-    <w:p/>
+    <w:p>
+      <w:pPr>
+        <w:rPr>
+          <w:b/>
+          <w:bCs/>
+        </w:rPr>
+      </w:pPr>
+      <w:r>
+        <w:rPr>
+          <w:b/>
+          <w:bCs/>
+        </w:rPr>
+        <w:lastRenderedPageBreak/>
+        <w:t>1</w:t>
+      </w:r>
+      <w:r>
+        <w:rPr>
+          <w:b/>
+          <w:bCs/>
+        </w:rPr>
+        <w:t>3</w:t>
+      </w:r>
+      <w:r>
+        <w:rPr>
+          <w:b/>
+          <w:bCs/>
+        </w:rPr>
+        <w:t>/07/2026</w:t>
+      </w:r>
+      <w:r>
+        <w:rPr>
+          <w:b/>
+          <w:bCs/>
+        </w:rPr>
+        <w:t xml:space="preserve"> </w:t>
+      </w:r>
+    </w:p>
+    <w:p>
+      <w:pPr>
+        <w:rPr>
+          <w:b/>
+          <w:bCs/>
+        </w:rPr>
+      </w:pPr>
+      <w:r>
+        <w:rPr>
+          <w:b/>
+          <w:bCs/>
+        </w:rPr>
+        <w:t>1. Corrección de Errores y Despliegue Inicial (CI/CD)</w:t>
+      </w:r>
+    </w:p>
+    <w:p>
+      <w:pPr>
+        <w:numPr>
+          <w:ilvl w:val="0"/>
+          <w:numId w:val="13"/>
+        </w:numPr>
+      </w:pPr>
+      <w:r>
+        <w:rPr>
+          <w:b/>
+          <w:bCs/>
+        </w:rPr>
+        <w:t xml:space="preserve">Resolución del </w:t>
+      </w:r>
+      <w:proofErr w:type="spellStart"/>
+      <w:r>
+        <w:rPr>
+          <w:b/>
+          <w:bCs/>
+        </w:rPr>
+        <w:t>Dockerfile</w:t>
+      </w:r>
+      <w:proofErr w:type="spellEnd"/>
+      <w:r>
+        <w:rPr>
+          <w:b/>
+          <w:bCs/>
+        </w:rPr>
+        <w:t>:</w:t>
+      </w:r>
+      <w:r>
+        <w:t xml:space="preserve"> Se solucionó un error de </w:t>
+      </w:r>
+      <w:proofErr w:type="spellStart"/>
+      <w:r>
+        <w:t>parseo</w:t>
+      </w:r>
+      <w:proofErr w:type="spellEnd"/>
+      <w:r>
+        <w:t xml:space="preserve"> en la línea 4 (COPY </w:t>
+      </w:r>
+      <w:proofErr w:type="spellStart"/>
+      <w:r>
+        <w:t>requires</w:t>
+      </w:r>
+      <w:proofErr w:type="spellEnd"/>
+      <w:r>
+        <w:t xml:space="preserve"> at </w:t>
+      </w:r>
+      <w:proofErr w:type="spellStart"/>
+      <w:r>
+        <w:t>least</w:t>
+      </w:r>
+      <w:proofErr w:type="spellEnd"/>
+      <w:r>
+        <w:t xml:space="preserve"> </w:t>
+      </w:r>
+      <w:proofErr w:type="spellStart"/>
+      <w:r>
+        <w:t>two</w:t>
+      </w:r>
+      <w:proofErr w:type="spellEnd"/>
+      <w:r>
+        <w:t xml:space="preserve"> </w:t>
+      </w:r>
+      <w:proofErr w:type="spellStart"/>
+      <w:r>
+        <w:t>arguments</w:t>
+      </w:r>
+      <w:proofErr w:type="spellEnd"/>
+      <w:r>
+        <w:t>) añadiendo el punto de destino (.) para indicar el directorio de trabajo actual.</w:t>
+      </w:r>
+    </w:p>
+    <w:p>
+      <w:pPr>
+        <w:numPr>
+          <w:ilvl w:val="0"/>
+          <w:numId w:val="13"/>
+        </w:numPr>
+      </w:pPr>
+      <w:r>
+        <w:rPr>
+          <w:b/>
+          <w:bCs/>
+        </w:rPr>
+        <w:t>Primer Despliegue Exitoso:</w:t>
+      </w:r>
+      <w:r>
+        <w:t xml:space="preserve"> Tras el </w:t>
+      </w:r>
+      <w:proofErr w:type="spellStart"/>
+      <w:r>
+        <w:rPr>
+          <w:i/>
+          <w:iCs/>
+        </w:rPr>
+        <w:t>commit</w:t>
+      </w:r>
+      <w:proofErr w:type="spellEnd"/>
+      <w:r>
+        <w:t xml:space="preserve">, GitHub </w:t>
+      </w:r>
+      <w:proofErr w:type="spellStart"/>
+      <w:r>
+        <w:t>Actions</w:t>
+      </w:r>
+      <w:proofErr w:type="spellEnd"/>
+      <w:r>
+        <w:t xml:space="preserve"> fue capaz de construir la imagen Docker, ejecutar el contenedor, descargar los datos de </w:t>
+      </w:r>
+      <w:proofErr w:type="spellStart"/>
+      <w:r>
+        <w:t>Yahoo</w:t>
+      </w:r>
+      <w:proofErr w:type="spellEnd"/>
+      <w:r>
+        <w:t xml:space="preserve"> </w:t>
+      </w:r>
+      <w:proofErr w:type="spellStart"/>
+      <w:r>
+        <w:t>Finance</w:t>
+      </w:r>
+      <w:proofErr w:type="spellEnd"/>
+      <w:r>
+        <w:t xml:space="preserve"> y cargar la fila en Google </w:t>
+      </w:r>
+      <w:proofErr w:type="spellStart"/>
+      <w:r>
+        <w:t>BigQuery</w:t>
+      </w:r>
+      <w:proofErr w:type="spellEnd"/>
+      <w:r>
+        <w:t xml:space="preserve"> en 1 minuto y 14 segundos.</w:t>
+      </w:r>
+    </w:p>
+    <w:p>
+      <w:pPr>
+        <w:rPr>
+          <w:b/>
+          <w:bCs/>
+        </w:rPr>
+      </w:pPr>
+      <w:r>
+        <w:rPr>
+          <w:b/>
+          <w:bCs/>
+        </w:rPr>
+        <w:t>2. Orquestación y Estrategia Temporal (Cron Jobs)</w:t>
+      </w:r>
+    </w:p>
+    <w:p>
+      <w:pPr>
+        <w:numPr>
+          <w:ilvl w:val="0"/>
+          <w:numId w:val="14"/>
+        </w:numPr>
+      </w:pPr>
+      <w:r>
+        <w:rPr>
+          <w:b/>
+          <w:bCs/>
+        </w:rPr>
+        <w:t>Configuración del Disparador:</w:t>
+      </w:r>
+      <w:r>
+        <w:t xml:space="preserve"> Se estableció la automatización mediante cron (0 21 * * *) para ejecutar el pipeline todos los días a las 21:00 UTC (23:00 CEST, hora peninsular española).</w:t>
+      </w:r>
+    </w:p>
+    <w:p>
+      <w:pPr>
+        <w:numPr>
+          <w:ilvl w:val="0"/>
+          <w:numId w:val="14"/>
+        </w:numPr>
+      </w:pPr>
+      <w:r>
+        <w:rPr>
+          <w:b/>
+          <w:bCs/>
+        </w:rPr>
+        <w:t>Lógica de Negocio:</w:t>
+      </w:r>
+      <w:r>
+        <w:t xml:space="preserve"> Se eligió esta franja horaria estratégicamente porque garantiza que el mercado americano (Wall Street) ya ha cerrado (22:00 CEST), asegurando que se extraen los precios de cierre definitivos y se consolida todo el volumen de noticias de la jornada.</w:t>
+      </w:r>
+    </w:p>
+    <w:p>
+      <w:pPr>
+        <w:rPr>
+          <w:b/>
+          <w:bCs/>
+        </w:rPr>
+      </w:pPr>
+      <w:r>
+        <w:rPr>
+          <w:b/>
+          <w:bCs/>
+        </w:rPr>
+        <w:t>3. Escalabilidad del Sistema (De 1 a 64 Activos)</w:t>
+      </w:r>
+    </w:p>
+    <w:p>
+      <w:pPr>
+        <w:numPr>
+          <w:ilvl w:val="0"/>
+          <w:numId w:val="15"/>
+        </w:numPr>
+      </w:pPr>
+      <w:r>
+        <w:rPr>
+          <w:b/>
+          <w:bCs/>
+        </w:rPr>
+        <w:t>Rediseño Modular:</w:t>
+      </w:r>
+      <w:r>
+        <w:t xml:space="preserve"> Se modificó el código de arranque en main.py y backfill.py sustituyendo las variables estáticas por un diccionario iterativo (STOCKS_TO_TRACK).</w:t>
+      </w:r>
+    </w:p>
+    <w:p>
+      <w:pPr>
+        <w:numPr>
+          <w:ilvl w:val="0"/>
+          <w:numId w:val="15"/>
+        </w:numPr>
+      </w:pPr>
+      <w:r>
+        <w:rPr>
+          <w:b/>
+          <w:bCs/>
+        </w:rPr>
+        <w:t>Expansión del Catálogo:</w:t>
+      </w:r>
+      <w:r>
+        <w:t xml:space="preserve"> El alcance del pipeline pasó de rastrear únicamente Apple (AAPL) a monitorizar 64 activos críticos para la economía global, abarcando sectores como:</w:t>
+      </w:r>
+    </w:p>
+    <w:p>
+      <w:pPr>
+        <w:numPr>
+          <w:ilvl w:val="1"/>
+          <w:numId w:val="15"/>
+        </w:numPr>
+      </w:pPr>
+      <w:r>
+        <w:rPr>
+          <w:b/>
+          <w:bCs/>
+        </w:rPr>
+        <w:t>Materias Primas:</w:t>
+      </w:r>
+      <w:r>
+        <w:t xml:space="preserve"> Oro, Plata, Cobre, Petróleo, Gas, sector alimentario.</w:t>
+      </w:r>
+    </w:p>
+    <w:p>
+      <w:pPr>
+        <w:numPr>
+          <w:ilvl w:val="1"/>
+          <w:numId w:val="15"/>
+        </w:numPr>
+      </w:pPr>
+      <w:r>
+        <w:rPr>
+          <w:b/>
+          <w:bCs/>
+        </w:rPr>
+        <w:t>Índices Globales:</w:t>
+      </w:r>
+      <w:r>
+        <w:t xml:space="preserve"> S&amp;P 500, Nasdaq, Dow Jones, IBEX 35, DAX, Nikkei.</w:t>
+      </w:r>
+    </w:p>
+    <w:p>
+      <w:pPr>
+        <w:numPr>
+          <w:ilvl w:val="1"/>
+          <w:numId w:val="15"/>
+        </w:numPr>
+      </w:pPr>
+      <w:r>
+        <w:rPr>
+          <w:b/>
+          <w:bCs/>
+        </w:rPr>
+        <w:t>Empresas Estratégicas:</w:t>
+      </w:r>
+      <w:r>
+        <w:t xml:space="preserve"> Tecnología e IA (</w:t>
+      </w:r>
+      <w:proofErr w:type="spellStart"/>
+      <w:r>
+        <w:t>Nvidia</w:t>
+      </w:r>
+      <w:proofErr w:type="spellEnd"/>
+      <w:r>
+        <w:t xml:space="preserve">, ASML), Automoción (Tesla, </w:t>
+      </w:r>
+      <w:proofErr w:type="spellStart"/>
+      <w:r>
+        <w:t>Stellantis</w:t>
+      </w:r>
+      <w:proofErr w:type="spellEnd"/>
+      <w:r>
+        <w:t>), Energía, Finanzas, Consumo, Salud y un bloque específico para la industria de los Videojuegos y el Entretenimiento (Sony, Nintendo, EA).</w:t>
+      </w:r>
+    </w:p>
+    <w:p>
+      <w:pPr>
+        <w:rPr>
+          <w:b/>
+          <w:bCs/>
+        </w:rPr>
+      </w:pPr>
+      <w:r>
+        <w:rPr>
+          <w:b/>
+          <w:bCs/>
+        </w:rPr>
+        <w:t>4. Resiliencia, Integridad de Datos y Límites de API</w:t>
+      </w:r>
+    </w:p>
+    <w:p>
+      <w:pPr>
+        <w:numPr>
+          <w:ilvl w:val="0"/>
+          <w:numId w:val="16"/>
+        </w:numPr>
+      </w:pPr>
+      <w:r>
+        <w:rPr>
+          <w:b/>
+          <w:bCs/>
+        </w:rPr>
+        <w:lastRenderedPageBreak/>
+        <w:t>Optimización de Cuotas (News API):</w:t>
+      </w:r>
+      <w:r>
+        <w:t xml:space="preserve"> Para evitar agotar el límite de 100 peticiones/día de la capa gratuita (Error 429), se ajustó el proceso de </w:t>
+      </w:r>
+      <w:proofErr w:type="spellStart"/>
+      <w:r>
+        <w:rPr>
+          <w:i/>
+          <w:iCs/>
+        </w:rPr>
+        <w:t>backfilling</w:t>
+      </w:r>
+      <w:proofErr w:type="spellEnd"/>
+      <w:r>
+        <w:t xml:space="preserve"> masivo a </w:t>
+      </w:r>
+      <w:r>
+        <w:rPr>
+          <w:b/>
+          <w:bCs/>
+        </w:rPr>
+        <w:t>1 solo día</w:t>
+      </w:r>
+      <w:r>
+        <w:t xml:space="preserve"> de profundidad histórica. Esto consume el 64% de la cuota, dejando un margen seguro del 36%.</w:t>
+      </w:r>
+    </w:p>
+    <w:p>
+      <w:pPr>
+        <w:numPr>
+          <w:ilvl w:val="0"/>
+          <w:numId w:val="16"/>
+        </w:numPr>
+      </w:pPr>
+      <w:r>
+        <w:rPr>
+          <w:b/>
+          <w:bCs/>
+        </w:rPr>
+        <w:t>Protección contra Saturación (Gemini API):</w:t>
+      </w:r>
+      <w:r>
+        <w:t xml:space="preserve"> * Se diagnosticó un error de superación de cuota por minuto (20 peticiones/minuto).</w:t>
+      </w:r>
+    </w:p>
+    <w:p>
+      <w:pPr>
+        <w:numPr>
+          <w:ilvl w:val="1"/>
+          <w:numId w:val="16"/>
+        </w:numPr>
+      </w:pPr>
+      <w:r>
+        <w:t>Se implementó una pausa estratégica (</w:t>
+      </w:r>
+      <w:proofErr w:type="spellStart"/>
+      <w:proofErr w:type="gramStart"/>
+      <w:r>
+        <w:t>time.sleep</w:t>
+      </w:r>
+      <w:proofErr w:type="spellEnd"/>
+      <w:proofErr w:type="gramEnd"/>
+      <w:r>
+        <w:t>(40)) en el orquestador principal para mantener un ritmo de ingesta estable y evitar el bloqueo de los servidores de Google.</w:t>
+      </w:r>
+    </w:p>
+    <w:p>
+      <w:pPr>
+        <w:numPr>
+          <w:ilvl w:val="1"/>
+          <w:numId w:val="16"/>
+        </w:numPr>
+      </w:pPr>
+      <w:r>
+        <w:t xml:space="preserve">Se identificó y resolvió el "Solapamiento de </w:t>
+      </w:r>
+      <w:proofErr w:type="spellStart"/>
+      <w:r>
+        <w:t>Cooldown</w:t>
+      </w:r>
+      <w:proofErr w:type="spellEnd"/>
+      <w:r>
+        <w:t>" al reiniciar el proceso.</w:t>
+      </w:r>
+    </w:p>
+    <w:p>
+      <w:pPr>
+        <w:numPr>
+          <w:ilvl w:val="0"/>
+          <w:numId w:val="16"/>
+        </w:numPr>
+      </w:pPr>
+      <w:r>
+        <w:rPr>
+          <w:b/>
+          <w:bCs/>
+        </w:rPr>
+        <w:t>Control de Fallos Silenciosos (Data Integrity):</w:t>
+      </w:r>
+      <w:r>
+        <w:t xml:space="preserve"> Se modificó la función </w:t>
+      </w:r>
+      <w:proofErr w:type="spellStart"/>
+      <w:r>
+        <w:t>analyze_sentiment</w:t>
+      </w:r>
+      <w:proofErr w:type="spellEnd"/>
+      <w:r>
+        <w:t xml:space="preserve"> en transform.py para que, en caso de caída temporal de la API, devuelva un valor nulo (</w:t>
+      </w:r>
+      <w:proofErr w:type="spellStart"/>
+      <w:r>
+        <w:t>None</w:t>
+      </w:r>
+      <w:proofErr w:type="spellEnd"/>
+      <w:r>
+        <w:t xml:space="preserve">) en lugar de un falso 0.0. Esto asegura que los </w:t>
+      </w:r>
+      <w:proofErr w:type="spellStart"/>
+      <w:r>
+        <w:rPr>
+          <w:i/>
+          <w:iCs/>
+        </w:rPr>
+        <w:t>NULLs</w:t>
+      </w:r>
+      <w:proofErr w:type="spellEnd"/>
+      <w:r>
+        <w:t xml:space="preserve"> en </w:t>
+      </w:r>
+      <w:proofErr w:type="spellStart"/>
+      <w:r>
+        <w:t>BigQuery</w:t>
+      </w:r>
+      <w:proofErr w:type="spellEnd"/>
+      <w:r>
+        <w:t xml:space="preserve"> no alteren las medias estadísticas futuras, manteniendo la base de datos analítica completamente limpia.</w:t>
+      </w:r>
+    </w:p>
+    <w:p>
+      <w:r>
+        <w:t>Has construido un motor de extracción y carga de datos que trabaja de manera autónoma, maneja errores de red sin romperse y cubre un espectro económico enorme. Este nivel de robustez es el que marca la diferencia en proyectos de Ciencia e Ingeniería de Datos.</w:t>
+      </w:r>
+    </w:p>
     <w:p>
       <w:pPr>
         <w:rPr>
@@ -1856,6 +2525,453 @@
 <file path=word/numbering.xml><?xml version="1.0" encoding="utf-8"?>
 <w:numbering xmlns:wpc="http://schemas.microsoft.com/office/word/2010/wordprocessingCanvas" xmlns:cx="http://schemas.microsoft.com/office/drawing/2014/chartex" xmlns:cx1="http://schemas.microsoft.com/office/drawing/2015/9/8/chartex" xmlns:cx2="http://schemas.microsoft.com/office/drawing/2015/10/21/chartex" xmlns:cx3="http://schemas.microsoft.com/office/drawing/2016/5/9/chartex" xmlns:cx4="http://schemas.microsoft.com/office/drawing/2016/5/10/chartex" xmlns:cx5="http://schemas.microsoft.com/office/drawing/2016/5/11/chartex" xmlns:cx6="http://schemas.microsoft.com/office/drawing/2016/5/12/chartex" xmlns:cx7="http://schemas.microsoft.com/office/drawing/2016/5/13/chartex" xmlns:cx8="http://schemas.microsoft.com/office/drawing/2016/5/14/chartex" xmlns:mc="http://schemas.openxmlformats.org/markup-compatibility/2006" xmlns:aink="http://schemas.microsoft.com/office/drawing/2016/ink" xmlns:am3d="http://schemas.microsoft.com/office/drawing/2017/model3d" xmlns:o="urn:schemas-microsoft-com:office:office" xmlns:oel="http://schemas.microsoft.com/office/2019/extlst" xmlns:r="http://schemas.openxmlformats.org/officeDocument/2006/relationships" xmlns:m="http://schemas.openxmlformats.org/officeDocument/2006/math" xmlns:v="urn:schemas-microsoft-com:vml" xmlns:wp14="http://schemas.microsoft.com/office/word/2010/wordprocessingDrawing" xmlns:wp="http://schemas.openxmlformats.org/drawingml/2006/wordprocessingDrawing" xmlns:w10="urn:schemas-microsoft-com:office:word" xmlns:w="http://schemas.openxmlformats.org/wordprocessingml/2006/main" xmlns:w14="http://schemas.microsoft.com/office/word/2010/wordml" xmlns:w15="http://schemas.microsoft.com/office/word/2012/wordml" xmlns:w16cex="http://schemas.microsoft.com/office/word/2018/wordml/cex" xmlns:w16cid="http://schemas.microsoft.com/office/word/2016/wordml/cid" xmlns:w16="http://schemas.microsoft.com/office/word/2018/wordml" xmlns:w16du="http://schemas.microsoft.com/office/word/2023/wordml/word16du" xmlns:w16sdtdh="http://schemas.microsoft.com/office/word/2020/wordml/sdtdatahash" xmlns:w16sdtfl="http://schemas.microsoft.com/office/word/2024/wordml/sdtformatlock" xmlns:w16se="http://schemas.microsoft.com/office/word/2015/wordml/symex" xmlns:wpg="http://schemas.microsoft.com/office/word/2010/wordprocessingGroup" xmlns:wpi="http://schemas.microsoft.com/office/word/2010/wordprocessingInk" xmlns:wne="http://schemas.microsoft.com/office/word/2006/wordml" xmlns:wps="http://schemas.microsoft.com/office/word/2010/wordprocessingShape" mc:Ignorable="w14 w15 w16se w16cid w16 w16cex w16sdtdh w16sdtfl w16du wp14">
   <w:abstractNum w:abstractNumId="0" w15:restartNumberingAfterBreak="0">
+    <w:nsid w:val="09B462E8"/>
+    <w:multiLevelType w:val="multilevel"/>
+    <w:tmpl w:val="41826B4A"/>
+    <w:lvl w:ilvl="0">
+      <w:start w:val="1"/>
+      <w:numFmt w:val="bullet"/>
+      <w:lvlText w:val=""/>
+      <w:lvlJc w:val="left"/>
+      <w:pPr>
+        <w:tabs>
+          <w:tab w:val="num" w:pos="720"/>
+        </w:tabs>
+        <w:ind w:left="720" w:hanging="360"/>
+      </w:pPr>
+      <w:rPr>
+        <w:rFonts w:ascii="Symbol" w:hAnsi="Symbol" w:hint="default"/>
+        <w:sz w:val="20"/>
+      </w:rPr>
+    </w:lvl>
+    <w:lvl w:ilvl="1" w:tentative="1">
+      <w:start w:val="1"/>
+      <w:numFmt w:val="bullet"/>
+      <w:lvlText w:val="o"/>
+      <w:lvlJc w:val="left"/>
+      <w:pPr>
+        <w:tabs>
+          <w:tab w:val="num" w:pos="1440"/>
+        </w:tabs>
+        <w:ind w:left="1440" w:hanging="360"/>
+      </w:pPr>
+      <w:rPr>
+        <w:rFonts w:ascii="Courier New" w:hAnsi="Courier New" w:hint="default"/>
+        <w:sz w:val="20"/>
+      </w:rPr>
+    </w:lvl>
+    <w:lvl w:ilvl="2" w:tentative="1">
+      <w:start w:val="1"/>
+      <w:numFmt w:val="bullet"/>
+      <w:lvlText w:val=""/>
+      <w:lvlJc w:val="left"/>
+      <w:pPr>
+        <w:tabs>
+          <w:tab w:val="num" w:pos="2160"/>
+        </w:tabs>
+        <w:ind w:left="2160" w:hanging="360"/>
+      </w:pPr>
+      <w:rPr>
+        <w:rFonts w:ascii="Wingdings" w:hAnsi="Wingdings" w:hint="default"/>
+        <w:sz w:val="20"/>
+      </w:rPr>
+    </w:lvl>
+    <w:lvl w:ilvl="3" w:tentative="1">
+      <w:start w:val="1"/>
+      <w:numFmt w:val="bullet"/>
+      <w:lvlText w:val=""/>
+      <w:lvlJc w:val="left"/>
+      <w:pPr>
+        <w:tabs>
+          <w:tab w:val="num" w:pos="2880"/>
+        </w:tabs>
+        <w:ind w:left="2880" w:hanging="360"/>
+      </w:pPr>
+      <w:rPr>
+        <w:rFonts w:ascii="Wingdings" w:hAnsi="Wingdings" w:hint="default"/>
+        <w:sz w:val="20"/>
+      </w:rPr>
+    </w:lvl>
+    <w:lvl w:ilvl="4" w:tentative="1">
+      <w:start w:val="1"/>
+      <w:numFmt w:val="bullet"/>
+      <w:lvlText w:val=""/>
+      <w:lvlJc w:val="left"/>
+      <w:pPr>
+        <w:tabs>
+          <w:tab w:val="num" w:pos="3600"/>
+        </w:tabs>
+        <w:ind w:left="3600" w:hanging="360"/>
+      </w:pPr>
+      <w:rPr>
+        <w:rFonts w:ascii="Wingdings" w:hAnsi="Wingdings" w:hint="default"/>
+        <w:sz w:val="20"/>
+      </w:rPr>
+    </w:lvl>
+    <w:lvl w:ilvl="5" w:tentative="1">
+      <w:start w:val="1"/>
+      <w:numFmt w:val="bullet"/>
+      <w:lvlText w:val=""/>
+      <w:lvlJc w:val="left"/>
+      <w:pPr>
+        <w:tabs>
+          <w:tab w:val="num" w:pos="4320"/>
+        </w:tabs>
+        <w:ind w:left="4320" w:hanging="360"/>
+      </w:pPr>
+      <w:rPr>
+        <w:rFonts w:ascii="Wingdings" w:hAnsi="Wingdings" w:hint="default"/>
+        <w:sz w:val="20"/>
+      </w:rPr>
+    </w:lvl>
+    <w:lvl w:ilvl="6" w:tentative="1">
+      <w:start w:val="1"/>
+      <w:numFmt w:val="bullet"/>
+      <w:lvlText w:val=""/>
+      <w:lvlJc w:val="left"/>
+      <w:pPr>
+        <w:tabs>
+          <w:tab w:val="num" w:pos="5040"/>
+        </w:tabs>
+        <w:ind w:left="5040" w:hanging="360"/>
+      </w:pPr>
+      <w:rPr>
+        <w:rFonts w:ascii="Wingdings" w:hAnsi="Wingdings" w:hint="default"/>
+        <w:sz w:val="20"/>
+      </w:rPr>
+    </w:lvl>
+    <w:lvl w:ilvl="7" w:tentative="1">
+      <w:start w:val="1"/>
+      <w:numFmt w:val="bullet"/>
+      <w:lvlText w:val=""/>
+      <w:lvlJc w:val="left"/>
+      <w:pPr>
+        <w:tabs>
+          <w:tab w:val="num" w:pos="5760"/>
+        </w:tabs>
+        <w:ind w:left="5760" w:hanging="360"/>
+      </w:pPr>
+      <w:rPr>
+        <w:rFonts w:ascii="Wingdings" w:hAnsi="Wingdings" w:hint="default"/>
+        <w:sz w:val="20"/>
+      </w:rPr>
+    </w:lvl>
+    <w:lvl w:ilvl="8" w:tentative="1">
+      <w:start w:val="1"/>
+      <w:numFmt w:val="bullet"/>
+      <w:lvlText w:val=""/>
+      <w:lvlJc w:val="left"/>
+      <w:pPr>
+        <w:tabs>
+          <w:tab w:val="num" w:pos="6480"/>
+        </w:tabs>
+        <w:ind w:left="6480" w:hanging="360"/>
+      </w:pPr>
+      <w:rPr>
+        <w:rFonts w:ascii="Wingdings" w:hAnsi="Wingdings" w:hint="default"/>
+        <w:sz w:val="20"/>
+      </w:rPr>
+    </w:lvl>
+  </w:abstractNum>
+  <w:abstractNum w:abstractNumId="1" w15:restartNumberingAfterBreak="0">
+    <w:nsid w:val="0FC82C90"/>
+    <w:multiLevelType w:val="multilevel"/>
+    <w:tmpl w:val="7D00F5E0"/>
+    <w:lvl w:ilvl="0">
+      <w:start w:val="1"/>
+      <w:numFmt w:val="bullet"/>
+      <w:lvlText w:val=""/>
+      <w:lvlJc w:val="left"/>
+      <w:pPr>
+        <w:tabs>
+          <w:tab w:val="num" w:pos="720"/>
+        </w:tabs>
+        <w:ind w:left="720" w:hanging="360"/>
+      </w:pPr>
+      <w:rPr>
+        <w:rFonts w:ascii="Symbol" w:hAnsi="Symbol" w:hint="default"/>
+        <w:sz w:val="20"/>
+      </w:rPr>
+    </w:lvl>
+    <w:lvl w:ilvl="1">
+      <w:start w:val="1"/>
+      <w:numFmt w:val="bullet"/>
+      <w:lvlText w:val="o"/>
+      <w:lvlJc w:val="left"/>
+      <w:pPr>
+        <w:tabs>
+          <w:tab w:val="num" w:pos="1440"/>
+        </w:tabs>
+        <w:ind w:left="1440" w:hanging="360"/>
+      </w:pPr>
+      <w:rPr>
+        <w:rFonts w:ascii="Courier New" w:hAnsi="Courier New" w:hint="default"/>
+        <w:sz w:val="20"/>
+      </w:rPr>
+    </w:lvl>
+    <w:lvl w:ilvl="2" w:tentative="1">
+      <w:start w:val="1"/>
+      <w:numFmt w:val="bullet"/>
+      <w:lvlText w:val=""/>
+      <w:lvlJc w:val="left"/>
+      <w:pPr>
+        <w:tabs>
+          <w:tab w:val="num" w:pos="2160"/>
+        </w:tabs>
+        <w:ind w:left="2160" w:hanging="360"/>
+      </w:pPr>
+      <w:rPr>
+        <w:rFonts w:ascii="Wingdings" w:hAnsi="Wingdings" w:hint="default"/>
+        <w:sz w:val="20"/>
+      </w:rPr>
+    </w:lvl>
+    <w:lvl w:ilvl="3" w:tentative="1">
+      <w:start w:val="1"/>
+      <w:numFmt w:val="bullet"/>
+      <w:lvlText w:val=""/>
+      <w:lvlJc w:val="left"/>
+      <w:pPr>
+        <w:tabs>
+          <w:tab w:val="num" w:pos="2880"/>
+        </w:tabs>
+        <w:ind w:left="2880" w:hanging="360"/>
+      </w:pPr>
+      <w:rPr>
+        <w:rFonts w:ascii="Wingdings" w:hAnsi="Wingdings" w:hint="default"/>
+        <w:sz w:val="20"/>
+      </w:rPr>
+    </w:lvl>
+    <w:lvl w:ilvl="4" w:tentative="1">
+      <w:start w:val="1"/>
+      <w:numFmt w:val="bullet"/>
+      <w:lvlText w:val=""/>
+      <w:lvlJc w:val="left"/>
+      <w:pPr>
+        <w:tabs>
+          <w:tab w:val="num" w:pos="3600"/>
+        </w:tabs>
+        <w:ind w:left="3600" w:hanging="360"/>
+      </w:pPr>
+      <w:rPr>
+        <w:rFonts w:ascii="Wingdings" w:hAnsi="Wingdings" w:hint="default"/>
+        <w:sz w:val="20"/>
+      </w:rPr>
+    </w:lvl>
+    <w:lvl w:ilvl="5" w:tentative="1">
+      <w:start w:val="1"/>
+      <w:numFmt w:val="bullet"/>
+      <w:lvlText w:val=""/>
+      <w:lvlJc w:val="left"/>
+      <w:pPr>
+        <w:tabs>
+          <w:tab w:val="num" w:pos="4320"/>
+        </w:tabs>
+        <w:ind w:left="4320" w:hanging="360"/>
+      </w:pPr>
+      <w:rPr>
+        <w:rFonts w:ascii="Wingdings" w:hAnsi="Wingdings" w:hint="default"/>
+        <w:sz w:val="20"/>
+      </w:rPr>
+    </w:lvl>
+    <w:lvl w:ilvl="6" w:tentative="1">
+      <w:start w:val="1"/>
+      <w:numFmt w:val="bullet"/>
+      <w:lvlText w:val=""/>
+      <w:lvlJc w:val="left"/>
+      <w:pPr>
+        <w:tabs>
+          <w:tab w:val="num" w:pos="5040"/>
+        </w:tabs>
+        <w:ind w:left="5040" w:hanging="360"/>
+      </w:pPr>
+      <w:rPr>
+        <w:rFonts w:ascii="Wingdings" w:hAnsi="Wingdings" w:hint="default"/>
+        <w:sz w:val="20"/>
+      </w:rPr>
+    </w:lvl>
+    <w:lvl w:ilvl="7" w:tentative="1">
+      <w:start w:val="1"/>
+      <w:numFmt w:val="bullet"/>
+      <w:lvlText w:val=""/>
+      <w:lvlJc w:val="left"/>
+      <w:pPr>
+        <w:tabs>
+          <w:tab w:val="num" w:pos="5760"/>
+        </w:tabs>
+        <w:ind w:left="5760" w:hanging="360"/>
+      </w:pPr>
+      <w:rPr>
+        <w:rFonts w:ascii="Wingdings" w:hAnsi="Wingdings" w:hint="default"/>
+        <w:sz w:val="20"/>
+      </w:rPr>
+    </w:lvl>
+    <w:lvl w:ilvl="8" w:tentative="1">
+      <w:start w:val="1"/>
+      <w:numFmt w:val="bullet"/>
+      <w:lvlText w:val=""/>
+      <w:lvlJc w:val="left"/>
+      <w:pPr>
+        <w:tabs>
+          <w:tab w:val="num" w:pos="6480"/>
+        </w:tabs>
+        <w:ind w:left="6480" w:hanging="360"/>
+      </w:pPr>
+      <w:rPr>
+        <w:rFonts w:ascii="Wingdings" w:hAnsi="Wingdings" w:hint="default"/>
+        <w:sz w:val="20"/>
+      </w:rPr>
+    </w:lvl>
+  </w:abstractNum>
+  <w:abstractNum w:abstractNumId="2" w15:restartNumberingAfterBreak="0">
+    <w:nsid w:val="157718E3"/>
+    <w:multiLevelType w:val="multilevel"/>
+    <w:tmpl w:val="D0AE36C0"/>
+    <w:lvl w:ilvl="0">
+      <w:start w:val="1"/>
+      <w:numFmt w:val="bullet"/>
+      <w:lvlText w:val=""/>
+      <w:lvlJc w:val="left"/>
+      <w:pPr>
+        <w:tabs>
+          <w:tab w:val="num" w:pos="720"/>
+        </w:tabs>
+        <w:ind w:left="720" w:hanging="360"/>
+      </w:pPr>
+      <w:rPr>
+        <w:rFonts w:ascii="Symbol" w:hAnsi="Symbol" w:hint="default"/>
+        <w:sz w:val="20"/>
+      </w:rPr>
+    </w:lvl>
+    <w:lvl w:ilvl="1" w:tentative="1">
+      <w:start w:val="1"/>
+      <w:numFmt w:val="bullet"/>
+      <w:lvlText w:val="o"/>
+      <w:lvlJc w:val="left"/>
+      <w:pPr>
+        <w:tabs>
+          <w:tab w:val="num" w:pos="1440"/>
+        </w:tabs>
+        <w:ind w:left="1440" w:hanging="360"/>
+      </w:pPr>
+      <w:rPr>
+        <w:rFonts w:ascii="Courier New" w:hAnsi="Courier New" w:hint="default"/>
+        <w:sz w:val="20"/>
+      </w:rPr>
+    </w:lvl>
+    <w:lvl w:ilvl="2" w:tentative="1">
+      <w:start w:val="1"/>
+      <w:numFmt w:val="bullet"/>
+      <w:lvlText w:val=""/>
+      <w:lvlJc w:val="left"/>
+      <w:pPr>
+        <w:tabs>
+          <w:tab w:val="num" w:pos="2160"/>
+        </w:tabs>
+        <w:ind w:left="2160" w:hanging="360"/>
+      </w:pPr>
+      <w:rPr>
+        <w:rFonts w:ascii="Wingdings" w:hAnsi="Wingdings" w:hint="default"/>
+        <w:sz w:val="20"/>
+      </w:rPr>
+    </w:lvl>
+    <w:lvl w:ilvl="3" w:tentative="1">
+      <w:start w:val="1"/>
+      <w:numFmt w:val="bullet"/>
+      <w:lvlText w:val=""/>
+      <w:lvlJc w:val="left"/>
+      <w:pPr>
+        <w:tabs>
+          <w:tab w:val="num" w:pos="2880"/>
+        </w:tabs>
+        <w:ind w:left="2880" w:hanging="360"/>
+      </w:pPr>
+      <w:rPr>
+        <w:rFonts w:ascii="Wingdings" w:hAnsi="Wingdings" w:hint="default"/>
+        <w:sz w:val="20"/>
+      </w:rPr>
+    </w:lvl>
+    <w:lvl w:ilvl="4" w:tentative="1">
+      <w:start w:val="1"/>
+      <w:numFmt w:val="bullet"/>
+      <w:lvlText w:val=""/>
+      <w:lvlJc w:val="left"/>
+      <w:pPr>
+        <w:tabs>
+          <w:tab w:val="num" w:pos="3600"/>
+        </w:tabs>
+        <w:ind w:left="3600" w:hanging="360"/>
+      </w:pPr>
+      <w:rPr>
+        <w:rFonts w:ascii="Wingdings" w:hAnsi="Wingdings" w:hint="default"/>
+        <w:sz w:val="20"/>
+      </w:rPr>
+    </w:lvl>
+    <w:lvl w:ilvl="5" w:tentative="1">
+      <w:start w:val="1"/>
+      <w:numFmt w:val="bullet"/>
+      <w:lvlText w:val=""/>
+      <w:lvlJc w:val="left"/>
+      <w:pPr>
+        <w:tabs>
+          <w:tab w:val="num" w:pos="4320"/>
+        </w:tabs>
+        <w:ind w:left="4320" w:hanging="360"/>
+      </w:pPr>
+      <w:rPr>
+        <w:rFonts w:ascii="Wingdings" w:hAnsi="Wingdings" w:hint="default"/>
+        <w:sz w:val="20"/>
+      </w:rPr>
+    </w:lvl>
+    <w:lvl w:ilvl="6" w:tentative="1">
+      <w:start w:val="1"/>
+      <w:numFmt w:val="bullet"/>
+      <w:lvlText w:val=""/>
+      <w:lvlJc w:val="left"/>
+      <w:pPr>
+        <w:tabs>
+          <w:tab w:val="num" w:pos="5040"/>
+        </w:tabs>
+        <w:ind w:left="5040" w:hanging="360"/>
+      </w:pPr>
+      <w:rPr>
+        <w:rFonts w:ascii="Wingdings" w:hAnsi="Wingdings" w:hint="default"/>
+        <w:sz w:val="20"/>
+      </w:rPr>
+    </w:lvl>
+    <w:lvl w:ilvl="7" w:tentative="1">
+      <w:start w:val="1"/>
+      <w:numFmt w:val="bullet"/>
+      <w:lvlText w:val=""/>
+      <w:lvlJc w:val="left"/>
+      <w:pPr>
+        <w:tabs>
+          <w:tab w:val="num" w:pos="5760"/>
+        </w:tabs>
+        <w:ind w:left="5760" w:hanging="360"/>
+      </w:pPr>
+      <w:rPr>
+        <w:rFonts w:ascii="Wingdings" w:hAnsi="Wingdings" w:hint="default"/>
+        <w:sz w:val="20"/>
+      </w:rPr>
+    </w:lvl>
+    <w:lvl w:ilvl="8" w:tentative="1">
+      <w:start w:val="1"/>
+      <w:numFmt w:val="bullet"/>
+      <w:lvlText w:val=""/>
+      <w:lvlJc w:val="left"/>
+      <w:pPr>
+        <w:tabs>
+          <w:tab w:val="num" w:pos="6480"/>
+        </w:tabs>
+        <w:ind w:left="6480" w:hanging="360"/>
+      </w:pPr>
+      <w:rPr>
+        <w:rFonts w:ascii="Wingdings" w:hAnsi="Wingdings" w:hint="default"/>
+        <w:sz w:val="20"/>
+      </w:rPr>
+    </w:lvl>
+  </w:abstractNum>
+  <w:abstractNum w:abstractNumId="3" w15:restartNumberingAfterBreak="0">
     <w:nsid w:val="1B181BD3"/>
     <w:multiLevelType w:val="multilevel"/>
     <w:tmpl w:val="5030D106"/>
@@ -2004,7 +3120,7 @@
       </w:rPr>
     </w:lvl>
   </w:abstractNum>
-  <w:abstractNum w:abstractNumId="1" w15:restartNumberingAfterBreak="0">
+  <w:abstractNum w:abstractNumId="4" w15:restartNumberingAfterBreak="0">
     <w:nsid w:val="2A4B451E"/>
     <w:multiLevelType w:val="multilevel"/>
     <w:tmpl w:val="B302FF66"/>
@@ -2153,7 +3269,7 @@
       </w:rPr>
     </w:lvl>
   </w:abstractNum>
-  <w:abstractNum w:abstractNumId="2" w15:restartNumberingAfterBreak="0">
+  <w:abstractNum w:abstractNumId="5" w15:restartNumberingAfterBreak="0">
     <w:nsid w:val="2A9435C3"/>
     <w:multiLevelType w:val="multilevel"/>
     <w:tmpl w:val="6DFCE7E0"/>
@@ -2302,7 +3418,7 @@
       </w:rPr>
     </w:lvl>
   </w:abstractNum>
-  <w:abstractNum w:abstractNumId="3" w15:restartNumberingAfterBreak="0">
+  <w:abstractNum w:abstractNumId="6" w15:restartNumberingAfterBreak="0">
     <w:nsid w:val="3A5458EA"/>
     <w:multiLevelType w:val="multilevel"/>
     <w:tmpl w:val="A61CFDEC"/>
@@ -2451,7 +3567,7 @@
       </w:rPr>
     </w:lvl>
   </w:abstractNum>
-  <w:abstractNum w:abstractNumId="4" w15:restartNumberingAfterBreak="0">
+  <w:abstractNum w:abstractNumId="7" w15:restartNumberingAfterBreak="0">
     <w:nsid w:val="4E803CC8"/>
     <w:multiLevelType w:val="multilevel"/>
     <w:tmpl w:val="FCDAD574"/>
@@ -2600,7 +3716,7 @@
       </w:rPr>
     </w:lvl>
   </w:abstractNum>
-  <w:abstractNum w:abstractNumId="5" w15:restartNumberingAfterBreak="0">
+  <w:abstractNum w:abstractNumId="8" w15:restartNumberingAfterBreak="0">
     <w:nsid w:val="4EBA0CA9"/>
     <w:multiLevelType w:val="multilevel"/>
     <w:tmpl w:val="D95659C0"/>
@@ -2749,7 +3865,7 @@
       </w:rPr>
     </w:lvl>
   </w:abstractNum>
-  <w:abstractNum w:abstractNumId="6" w15:restartNumberingAfterBreak="0">
+  <w:abstractNum w:abstractNumId="9" w15:restartNumberingAfterBreak="0">
     <w:nsid w:val="550735C0"/>
     <w:multiLevelType w:val="multilevel"/>
     <w:tmpl w:val="A334B14C"/>
@@ -2898,7 +4014,7 @@
       </w:rPr>
     </w:lvl>
   </w:abstractNum>
-  <w:abstractNum w:abstractNumId="7" w15:restartNumberingAfterBreak="0">
+  <w:abstractNum w:abstractNumId="10" w15:restartNumberingAfterBreak="0">
     <w:nsid w:val="602230C7"/>
     <w:multiLevelType w:val="multilevel"/>
     <w:tmpl w:val="EFF89B92"/>
@@ -3047,7 +4163,7 @@
       </w:rPr>
     </w:lvl>
   </w:abstractNum>
-  <w:abstractNum w:abstractNumId="8" w15:restartNumberingAfterBreak="0">
+  <w:abstractNum w:abstractNumId="11" w15:restartNumberingAfterBreak="0">
     <w:nsid w:val="72277FBE"/>
     <w:multiLevelType w:val="multilevel"/>
     <w:tmpl w:val="F50EB84A"/>
@@ -3196,7 +4312,7 @@
       </w:rPr>
     </w:lvl>
   </w:abstractNum>
-  <w:abstractNum w:abstractNumId="9" w15:restartNumberingAfterBreak="0">
+  <w:abstractNum w:abstractNumId="12" w15:restartNumberingAfterBreak="0">
     <w:nsid w:val="731A7F7B"/>
     <w:multiLevelType w:val="multilevel"/>
     <w:tmpl w:val="CC56A3BA"/>
@@ -3345,7 +4461,7 @@
       </w:rPr>
     </w:lvl>
   </w:abstractNum>
-  <w:abstractNum w:abstractNumId="10" w15:restartNumberingAfterBreak="0">
+  <w:abstractNum w:abstractNumId="13" w15:restartNumberingAfterBreak="0">
     <w:nsid w:val="75BB47BF"/>
     <w:multiLevelType w:val="multilevel"/>
     <w:tmpl w:val="53B26BD2"/>
@@ -3494,7 +4610,7 @@
       </w:rPr>
     </w:lvl>
   </w:abstractNum>
-  <w:abstractNum w:abstractNumId="11" w15:restartNumberingAfterBreak="0">
+  <w:abstractNum w:abstractNumId="14" w15:restartNumberingAfterBreak="0">
     <w:nsid w:val="75C600AF"/>
     <w:multiLevelType w:val="multilevel"/>
     <w:tmpl w:val="AAF2B126"/>
@@ -3643,41 +4759,202 @@
       </w:rPr>
     </w:lvl>
   </w:abstractNum>
+  <w:abstractNum w:abstractNumId="15" w15:restartNumberingAfterBreak="0">
+    <w:nsid w:val="7FBE5D95"/>
+    <w:multiLevelType w:val="multilevel"/>
+    <w:tmpl w:val="D7B4CB1A"/>
+    <w:lvl w:ilvl="0">
+      <w:start w:val="1"/>
+      <w:numFmt w:val="bullet"/>
+      <w:lvlText w:val=""/>
+      <w:lvlJc w:val="left"/>
+      <w:pPr>
+        <w:tabs>
+          <w:tab w:val="num" w:pos="720"/>
+        </w:tabs>
+        <w:ind w:left="720" w:hanging="360"/>
+      </w:pPr>
+      <w:rPr>
+        <w:rFonts w:ascii="Symbol" w:hAnsi="Symbol" w:hint="default"/>
+        <w:sz w:val="20"/>
+      </w:rPr>
+    </w:lvl>
+    <w:lvl w:ilvl="1">
+      <w:start w:val="1"/>
+      <w:numFmt w:val="bullet"/>
+      <w:lvlText w:val="o"/>
+      <w:lvlJc w:val="left"/>
+      <w:pPr>
+        <w:tabs>
+          <w:tab w:val="num" w:pos="1440"/>
+        </w:tabs>
+        <w:ind w:left="1440" w:hanging="360"/>
+      </w:pPr>
+      <w:rPr>
+        <w:rFonts w:ascii="Courier New" w:hAnsi="Courier New" w:hint="default"/>
+        <w:sz w:val="20"/>
+      </w:rPr>
+    </w:lvl>
+    <w:lvl w:ilvl="2" w:tentative="1">
+      <w:start w:val="1"/>
+      <w:numFmt w:val="bullet"/>
+      <w:lvlText w:val=""/>
+      <w:lvlJc w:val="left"/>
+      <w:pPr>
+        <w:tabs>
+          <w:tab w:val="num" w:pos="2160"/>
+        </w:tabs>
+        <w:ind w:left="2160" w:hanging="360"/>
+      </w:pPr>
+      <w:rPr>
+        <w:rFonts w:ascii="Wingdings" w:hAnsi="Wingdings" w:hint="default"/>
+        <w:sz w:val="20"/>
+      </w:rPr>
+    </w:lvl>
+    <w:lvl w:ilvl="3" w:tentative="1">
+      <w:start w:val="1"/>
+      <w:numFmt w:val="bullet"/>
+      <w:lvlText w:val=""/>
+      <w:lvlJc w:val="left"/>
+      <w:pPr>
+        <w:tabs>
+          <w:tab w:val="num" w:pos="2880"/>
+        </w:tabs>
+        <w:ind w:left="2880" w:hanging="360"/>
+      </w:pPr>
+      <w:rPr>
+        <w:rFonts w:ascii="Wingdings" w:hAnsi="Wingdings" w:hint="default"/>
+        <w:sz w:val="20"/>
+      </w:rPr>
+    </w:lvl>
+    <w:lvl w:ilvl="4" w:tentative="1">
+      <w:start w:val="1"/>
+      <w:numFmt w:val="bullet"/>
+      <w:lvlText w:val=""/>
+      <w:lvlJc w:val="left"/>
+      <w:pPr>
+        <w:tabs>
+          <w:tab w:val="num" w:pos="3600"/>
+        </w:tabs>
+        <w:ind w:left="3600" w:hanging="360"/>
+      </w:pPr>
+      <w:rPr>
+        <w:rFonts w:ascii="Wingdings" w:hAnsi="Wingdings" w:hint="default"/>
+        <w:sz w:val="20"/>
+      </w:rPr>
+    </w:lvl>
+    <w:lvl w:ilvl="5" w:tentative="1">
+      <w:start w:val="1"/>
+      <w:numFmt w:val="bullet"/>
+      <w:lvlText w:val=""/>
+      <w:lvlJc w:val="left"/>
+      <w:pPr>
+        <w:tabs>
+          <w:tab w:val="num" w:pos="4320"/>
+        </w:tabs>
+        <w:ind w:left="4320" w:hanging="360"/>
+      </w:pPr>
+      <w:rPr>
+        <w:rFonts w:ascii="Wingdings" w:hAnsi="Wingdings" w:hint="default"/>
+        <w:sz w:val="20"/>
+      </w:rPr>
+    </w:lvl>
+    <w:lvl w:ilvl="6" w:tentative="1">
+      <w:start w:val="1"/>
+      <w:numFmt w:val="bullet"/>
+      <w:lvlText w:val=""/>
+      <w:lvlJc w:val="left"/>
+      <w:pPr>
+        <w:tabs>
+          <w:tab w:val="num" w:pos="5040"/>
+        </w:tabs>
+        <w:ind w:left="5040" w:hanging="360"/>
+      </w:pPr>
+      <w:rPr>
+        <w:rFonts w:ascii="Wingdings" w:hAnsi="Wingdings" w:hint="default"/>
+        <w:sz w:val="20"/>
+      </w:rPr>
+    </w:lvl>
+    <w:lvl w:ilvl="7" w:tentative="1">
+      <w:start w:val="1"/>
+      <w:numFmt w:val="bullet"/>
+      <w:lvlText w:val=""/>
+      <w:lvlJc w:val="left"/>
+      <w:pPr>
+        <w:tabs>
+          <w:tab w:val="num" w:pos="5760"/>
+        </w:tabs>
+        <w:ind w:left="5760" w:hanging="360"/>
+      </w:pPr>
+      <w:rPr>
+        <w:rFonts w:ascii="Wingdings" w:hAnsi="Wingdings" w:hint="default"/>
+        <w:sz w:val="20"/>
+      </w:rPr>
+    </w:lvl>
+    <w:lvl w:ilvl="8" w:tentative="1">
+      <w:start w:val="1"/>
+      <w:numFmt w:val="bullet"/>
+      <w:lvlText w:val=""/>
+      <w:lvlJc w:val="left"/>
+      <w:pPr>
+        <w:tabs>
+          <w:tab w:val="num" w:pos="6480"/>
+        </w:tabs>
+        <w:ind w:left="6480" w:hanging="360"/>
+      </w:pPr>
+      <w:rPr>
+        <w:rFonts w:ascii="Wingdings" w:hAnsi="Wingdings" w:hint="default"/>
+        <w:sz w:val="20"/>
+      </w:rPr>
+    </w:lvl>
+  </w:abstractNum>
   <w:num w:numId="1" w16cid:durableId="1807157444">
+    <w:abstractNumId w:val="10"/>
+  </w:num>
+  <w:num w:numId="2" w16cid:durableId="814878092">
+    <w:abstractNumId w:val="11"/>
+  </w:num>
+  <w:num w:numId="3" w16cid:durableId="1493175462">
+    <w:abstractNumId w:val="12"/>
+  </w:num>
+  <w:num w:numId="4" w16cid:durableId="2089963244">
+    <w:abstractNumId w:val="13"/>
+  </w:num>
+  <w:num w:numId="5" w16cid:durableId="1804228442">
+    <w:abstractNumId w:val="6"/>
+  </w:num>
+  <w:num w:numId="6" w16cid:durableId="836381710">
+    <w:abstractNumId w:val="9"/>
+  </w:num>
+  <w:num w:numId="7" w16cid:durableId="1161966786">
+    <w:abstractNumId w:val="8"/>
+  </w:num>
+  <w:num w:numId="8" w16cid:durableId="319191962">
+    <w:abstractNumId w:val="5"/>
+  </w:num>
+  <w:num w:numId="9" w16cid:durableId="1124471293">
+    <w:abstractNumId w:val="3"/>
+  </w:num>
+  <w:num w:numId="10" w16cid:durableId="855578222">
     <w:abstractNumId w:val="7"/>
   </w:num>
-  <w:num w:numId="2" w16cid:durableId="814878092">
-    <w:abstractNumId w:val="8"/>
+  <w:num w:numId="11" w16cid:durableId="965938592">
+    <w:abstractNumId w:val="4"/>
   </w:num>
-  <w:num w:numId="3" w16cid:durableId="1493175462">
-    <w:abstractNumId w:val="9"/>
+  <w:num w:numId="12" w16cid:durableId="1368483677">
+    <w:abstractNumId w:val="14"/>
   </w:num>
-  <w:num w:numId="4" w16cid:durableId="2089963244">
-    <w:abstractNumId w:val="10"/>
+  <w:num w:numId="13" w16cid:durableId="990985907">
+    <w:abstractNumId w:val="0"/>
   </w:num>
-  <w:num w:numId="5" w16cid:durableId="1804228442">
-    <w:abstractNumId w:val="3"/>
-  </w:num>
-  <w:num w:numId="6" w16cid:durableId="836381710">
-    <w:abstractNumId w:val="6"/>
-  </w:num>
-  <w:num w:numId="7" w16cid:durableId="1161966786">
-    <w:abstractNumId w:val="5"/>
-  </w:num>
-  <w:num w:numId="8" w16cid:durableId="319191962">
+  <w:num w:numId="14" w16cid:durableId="1708290789">
     <w:abstractNumId w:val="2"/>
   </w:num>
-  <w:num w:numId="9" w16cid:durableId="1124471293">
-    <w:abstractNumId w:val="0"/>
-  </w:num>
-  <w:num w:numId="10" w16cid:durableId="855578222">
-    <w:abstractNumId w:val="4"/>
-  </w:num>
-  <w:num w:numId="11" w16cid:durableId="965938592">
+  <w:num w:numId="15" w16cid:durableId="586233235">
     <w:abstractNumId w:val="1"/>
   </w:num>
-  <w:num w:numId="12" w16cid:durableId="1368483677">
-    <w:abstractNumId w:val="11"/>
+  <w:num w:numId="16" w16cid:durableId="331688689">
+    <w:abstractNumId w:val="15"/>
   </w:num>
 </w:numbering>
 </file>

</xml_diff>